<commit_message>
updated resume and the new project discription
</commit_message>
<xml_diff>
--- a/assets/Resume.docx
+++ b/assets/Resume.docx
@@ -240,7 +240,43 @@
           <w:sz w:val="20"/>
           <w:szCs w:val="24"/>
         </w:rPr>
-        <w:t>AI Engineer Intern building production AI systems spanning Computer Vision, LLM integration, RAG pipelines, and AI workflow orchestration. Currently developing an AI model evaluation and orchestration platform for testing multi-provider LLMs while delivering Computer Vision and Generative AI solutions at Difinity Digital. Published research at IEEE ICNPCV 2026 on hybrid deep learning frameworks. Passionate about scalable AI infrastructure — from model experimentation to deployment-ready intelligent systems.</w:t>
+        <w:t xml:space="preserve">AI Engineer Intern building production AI systems spanning Computer Vision, LLM integration, RAG pipelines, and AI workflow orchestration. Currently developing an AI model evaluation and orchestration platform for testing multi-provider LLMs while delivering Computer Vision and Generative AI solutions at </w:t>
+      </w:r>
+      <w:r>
+        <w:rPr>
+          <w:b/>
+          <w:bCs/>
+          <w:color w:val="2A2A2A"/>
+          <w:sz w:val="20"/>
+          <w:szCs w:val="24"/>
+        </w:rPr>
+        <w:t>Difinity Digital</w:t>
+      </w:r>
+      <w:r>
+        <w:rPr>
+          <w:color w:val="2A2A2A"/>
+          <w:sz w:val="20"/>
+          <w:szCs w:val="24"/>
+        </w:rPr>
+        <w:t xml:space="preserve">. Published research at </w:t>
+      </w:r>
+      <w:r>
+        <w:rPr>
+          <w:b/>
+          <w:bCs/>
+          <w:color w:val="2A2A2A"/>
+          <w:sz w:val="20"/>
+          <w:szCs w:val="24"/>
+        </w:rPr>
+        <w:t>IEEE ICNPCV 2026</w:t>
+      </w:r>
+      <w:r>
+        <w:rPr>
+          <w:color w:val="2A2A2A"/>
+          <w:sz w:val="20"/>
+          <w:szCs w:val="24"/>
+        </w:rPr>
+        <w:t xml:space="preserve"> on hybrid deep learning frameworks. Passionate about scalable AI infrastructure — from model experimentation to deployment-ready intelligent systems.</w:t>
       </w:r>
     </w:p>
     <w:p>
@@ -295,7 +331,7 @@
           <w:sz w:val="20"/>
           <w:szCs w:val="24"/>
         </w:rPr>
-        <w:t>Computer Vision, Deep Learning, CNNs, YOLO, LLM Integration, RAG (Retrieval-Augmented Generation), Prompt Engineering, Model Evaluation &amp; Benchmarking, AI Workflow Orchestration, Conversational AI, AI Agent Development</w:t>
+        <w:t>Computer Vision, Deep Learning, CNNs, YOLO, LLM Integration, RAG, Prompt Engineering, Model Evaluation &amp; Benchmarking, AI Workflow Orchestration, Conversational AI</w:t>
       </w:r>
     </w:p>
     <w:p>
@@ -320,7 +356,15 @@
           <w:sz w:val="20"/>
           <w:szCs w:val="24"/>
         </w:rPr>
-        <w:t>Google Gemini AI, OpenAI-Compatible APIs, SSE Streaming, Multi-Model Routing, Vector Embeddings (pgvector), Semantic Search, AI Memory Systems, Agentic AI Pipelines</w:t>
+        <w:t>Commercial LLM APIs (Gemini, OpenAI, NVIDIA)</w:t>
+      </w:r>
+      <w:r>
+        <w:rPr>
+          <w:color w:val="333333"/>
+          <w:sz w:val="20"/>
+          <w:szCs w:val="24"/>
+        </w:rPr>
+        <w:t>, SSE Streaming, AI Memory Systems</w:t>
       </w:r>
     </w:p>
     <w:p>
@@ -388,16 +432,7 @@
           <w:sz w:val="20"/>
           <w:szCs w:val="24"/>
         </w:rPr>
-        <w:t>Cloud &amp; Platforms</w:t>
-      </w:r>
-      <w:proofErr w:type="gramStart"/>
-      <w:r>
-        <w:rPr>
-          <w:b/>
-          <w:sz w:val="20"/>
-          <w:szCs w:val="24"/>
-        </w:rPr>
-        <w:t xml:space="preserve">:  </w:t>
+        <w:t xml:space="preserve">Cloud &amp; Platforms:  </w:t>
       </w:r>
       <w:r>
         <w:rPr>
@@ -405,16 +440,7 @@
           <w:sz w:val="20"/>
           <w:szCs w:val="24"/>
         </w:rPr>
-        <w:t>Oracle</w:t>
-      </w:r>
-      <w:proofErr w:type="gramEnd"/>
-      <w:r>
-        <w:rPr>
-          <w:color w:val="333333"/>
-          <w:sz w:val="20"/>
-          <w:szCs w:val="24"/>
-        </w:rPr>
-        <w:t xml:space="preserve"> Cloud Infrastructure (OCI AI Foundations), AWS Fundamentals, Google AI Essentials</w:t>
+        <w:t>Oracle Cloud Infrastructure (OCI AI Foundations), AWS Fundamentals, Google AI Essentials</w:t>
       </w:r>
     </w:p>
     <w:p>
@@ -518,7 +544,25 @@
           <w:sz w:val="20"/>
           <w:szCs w:val="24"/>
         </w:rPr>
-        <w:t>Developing AI-powered applications using Python, FastAPI, and REST APIs for real-world client deployments.</w:t>
+        <w:t xml:space="preserve">Developing AI-powered applications using Python, FastAPI, and REST APIs for real-world client deployments. Internship concludes </w:t>
+      </w:r>
+      <w:r>
+        <w:rPr>
+          <w:b/>
+          <w:bCs/>
+          <w:color w:val="2A2A2A"/>
+          <w:sz w:val="20"/>
+          <w:szCs w:val="24"/>
+        </w:rPr>
+        <w:t>September 8, 2026</w:t>
+      </w:r>
+      <w:r>
+        <w:rPr>
+          <w:color w:val="2A2A2A"/>
+          <w:sz w:val="20"/>
+          <w:szCs w:val="24"/>
+        </w:rPr>
+        <w:t>.</w:t>
       </w:r>
     </w:p>
     <w:p>
@@ -581,17 +625,19 @@
         </w:pBdr>
         <w:spacing w:before="120" w:after="60"/>
         <w:rPr>
-          <w:sz w:val="20"/>
-          <w:szCs w:val="24"/>
-        </w:rPr>
-      </w:pPr>
-      <w:r>
-        <w:rPr>
           <w:b/>
           <w:color w:val="0D0D0D"/>
           <w:sz w:val="22"/>
           <w:szCs w:val="24"/>
         </w:rPr>
+      </w:pPr>
+      <w:r>
+        <w:rPr>
+          <w:b/>
+          <w:color w:val="0D0D0D"/>
+          <w:sz w:val="22"/>
+          <w:szCs w:val="24"/>
+        </w:rPr>
         <w:t>PROJECTS</w:t>
       </w:r>
     </w:p>
@@ -606,14 +652,33 @@
           <w:szCs w:val="24"/>
         </w:rPr>
       </w:pPr>
+      <w:hyperlink r:id="rId11" w:history="1">
+        <w:r>
+          <w:rPr>
+            <w:rStyle w:val="Hyperlink"/>
+            <w:b/>
+            <w:color w:val="auto"/>
+            <w:sz w:val="22"/>
+            <w:szCs w:val="24"/>
+            <w:u w:val="none"/>
+          </w:rPr>
+          <w:t>OpenMind AI Platform — AI Model Evaluation &amp; LLM Orchestration Platform</w:t>
+        </w:r>
+      </w:hyperlink>
       <w:r>
         <w:rPr>
           <w:b/>
-          <w:color w:val="0D0D0D"/>
+          <w:color w:val="auto"/>
           <w:sz w:val="22"/>
           <w:szCs w:val="24"/>
         </w:rPr>
-        <w:t>OpenMind AI Platform — AI Model Evaluation &amp; LLM Orchestration Platform</w:t>
+        <w:t xml:space="preserve"> </w:t>
+      </w:r>
+      <w:r>
+        <w:rPr>
+          <w:rFonts w:ascii="Segoe UI Emoji" w:hAnsi="Segoe UI Emoji" w:cs="Segoe UI Emoji"/>
+        </w:rPr>
+        <w:t>🔗</w:t>
       </w:r>
       <w:r>
         <w:rPr>
@@ -712,7 +777,15 @@
           <w:sz w:val="20"/>
           <w:szCs w:val="24"/>
         </w:rPr>
-        <w:t>Implementing a RAG pipeline with PDF/Markdown document ingestion, text chunking, and vector embedding infrastructure (pgvector) for semantic knowledge retrieval over custom documents.</w:t>
+        <w:t>Engineered the foundation for a RAG pipeline featuring PDF/Markdown document ingestion and text chunking, and currently architecting the pgvector infrastructure for upcoming semantic knowledge retrieval</w:t>
+      </w:r>
+      <w:r>
+        <w:rPr>
+          <w:color w:val="2A2A2A"/>
+          <w:sz w:val="20"/>
+          <w:szCs w:val="24"/>
+        </w:rPr>
+        <w:t>.</w:t>
       </w:r>
     </w:p>
     <w:p>
@@ -750,7 +823,7 @@
           <w:sz w:val="20"/>
           <w:szCs w:val="24"/>
         </w:rPr>
-        <w:t>Developing a multi-step AI workflow orchestration engine supporting LLM calls, conditional branching, API integration, memory retrieval, and human-in-the-loop approval steps.</w:t>
+        <w:t>Designed the architecture and simulation model for a multi-step AI workflow orchestration engine, paving the way for automated LLM routing, conditional branching, and API integration.</w:t>
       </w:r>
     </w:p>
     <w:p>
@@ -789,6 +862,150 @@
     </w:p>
     <w:p>
       <w:pPr>
+        <w:tabs>
+          <w:tab w:val="right" w:pos="10205"/>
+        </w:tabs>
+        <w:spacing w:before="60"/>
+        <w:rPr>
+          <w:b/>
+          <w:color w:val="0D0D0D"/>
+          <w:sz w:val="22"/>
+          <w:szCs w:val="24"/>
+        </w:rPr>
+      </w:pPr>
+    </w:p>
+    <w:p>
+      <w:pPr>
+        <w:tabs>
+          <w:tab w:val="right" w:pos="10205"/>
+        </w:tabs>
+        <w:spacing w:before="60"/>
+        <w:rPr>
+          <w:sz w:val="20"/>
+          <w:szCs w:val="24"/>
+        </w:rPr>
+      </w:pPr>
+      <w:hyperlink r:id="rId12" w:history="1">
+        <w:r>
+          <w:rPr>
+            <w:rStyle w:val="Hyperlink"/>
+            <w:b/>
+            <w:color w:val="auto"/>
+            <w:sz w:val="22"/>
+            <w:szCs w:val="24"/>
+            <w:u w:val="none"/>
+          </w:rPr>
+          <w:t>Hybrid CNN–YOLO Framework for Car Damage Severity Classification and Localization</w:t>
+        </w:r>
+      </w:hyperlink>
+      <w:r>
+        <w:rPr>
+          <w:b/>
+          <w:color w:val="auto"/>
+          <w:sz w:val="22"/>
+          <w:szCs w:val="24"/>
+        </w:rPr>
+        <w:t xml:space="preserve"> </w:t>
+      </w:r>
+      <w:r>
+        <w:rPr>
+          <w:rFonts w:ascii="Segoe UI Emoji" w:hAnsi="Segoe UI Emoji" w:cs="Segoe UI Emoji"/>
+        </w:rPr>
+        <w:t>🔗</w:t>
+      </w:r>
+      <w:r>
+        <w:rPr>
+          <w:sz w:val="20"/>
+          <w:szCs w:val="24"/>
+        </w:rPr>
+        <w:tab/>
+      </w:r>
+      <w:r>
+        <w:rPr>
+          <w:color w:val="555555"/>
+          <w:sz w:val="20"/>
+          <w:szCs w:val="24"/>
+        </w:rPr>
+        <w:t>2025 – 2026</w:t>
+      </w:r>
+    </w:p>
+    <w:p>
+      <w:pPr>
+        <w:spacing w:after="40"/>
+        <w:rPr>
+          <w:sz w:val="20"/>
+          <w:szCs w:val="24"/>
+        </w:rPr>
+      </w:pPr>
+      <w:r>
+        <w:rPr>
+          <w:b/>
+          <w:color w:val="1A5276"/>
+          <w:sz w:val="18"/>
+          <w:szCs w:val="24"/>
+        </w:rPr>
+        <w:t>Python | TensorFlow/Keras | YOLO | OpenCV | FastAPI | Computer Vision</w:t>
+      </w:r>
+    </w:p>
+    <w:p>
+      <w:pPr>
+        <w:pStyle w:val="ListBullet"/>
+        <w:spacing w:after="20"/>
+        <w:ind w:left="283"/>
+        <w:rPr>
+          <w:sz w:val="20"/>
+          <w:szCs w:val="24"/>
+        </w:rPr>
+      </w:pPr>
+      <w:r>
+        <w:rPr>
+          <w:color w:val="2A2A2A"/>
+          <w:sz w:val="20"/>
+          <w:szCs w:val="24"/>
+        </w:rPr>
+        <w:t>Developed an end-to-end hybrid deep learning framework integrating YOLO-based object detection with CNN-based severity classification for automated vehicle damage assessment.</w:t>
+      </w:r>
+    </w:p>
+    <w:p>
+      <w:pPr>
+        <w:pStyle w:val="ListBullet"/>
+        <w:spacing w:after="20"/>
+        <w:ind w:left="283"/>
+        <w:rPr>
+          <w:sz w:val="20"/>
+          <w:szCs w:val="24"/>
+        </w:rPr>
+      </w:pPr>
+      <w:r>
+        <w:rPr>
+          <w:color w:val="2A2A2A"/>
+          <w:sz w:val="20"/>
+          <w:szCs w:val="24"/>
+        </w:rPr>
+        <w:t>Built the complete ML pipeline including dataset preparation, model training, hyperparameter tuning, evaluation metrics, and a FastAPI inference backend for real-time predictions.</w:t>
+      </w:r>
+    </w:p>
+    <w:p>
+      <w:pPr>
+        <w:pStyle w:val="ListBullet"/>
+        <w:spacing w:after="20"/>
+        <w:ind w:left="283"/>
+        <w:rPr>
+          <w:sz w:val="20"/>
+          <w:szCs w:val="24"/>
+        </w:rPr>
+      </w:pPr>
+      <w:r>
+        <w:rPr>
+          <w:color w:val="2A2A2A"/>
+          <w:sz w:val="20"/>
+          <w:szCs w:val="24"/>
+        </w:rPr>
+        <w:t>Presented the research at the 2026 IEEE International Conference on Natural Language Processing and Computer Vision (ICNPCV), Bengaluru, India.</w:t>
+      </w:r>
+    </w:p>
+    <w:p>
+      <w:pPr>
         <w:pStyle w:val="ListBullet"/>
         <w:numPr>
           <w:ilvl w:val="0"/>
@@ -797,8 +1014,8 @@
         <w:spacing w:after="20"/>
         <w:ind w:left="-77"/>
         <w:rPr>
-          <w:sz w:val="20"/>
-          <w:szCs w:val="24"/>
+          <w:sz w:val="4"/>
+          <w:szCs w:val="4"/>
         </w:rPr>
       </w:pPr>
     </w:p>
@@ -813,15 +1030,27 @@
           <w:szCs w:val="24"/>
         </w:rPr>
       </w:pPr>
+      <w:hyperlink r:id="rId13" w:history="1">
+        <w:r>
+          <w:rPr>
+            <w:rStyle w:val="Hyperlink"/>
+            <w:b/>
+            <w:color w:val="auto"/>
+            <w:sz w:val="22"/>
+            <w:szCs w:val="24"/>
+            <w:u w:val="none"/>
+          </w:rPr>
+          <w:t>Vocalix — AI Voice Assistant</w:t>
+        </w:r>
+      </w:hyperlink>
       <w:r>
-        <w:rPr>
-          <w:b/>
-          <w:color w:val="0D0D0D"/>
-          <w:sz w:val="22"/>
-          <w:szCs w:val="24"/>
-        </w:rPr>
-        <w:lastRenderedPageBreak/>
-        <w:t>Hybrid CNN–YOLO Framework for Car Damage Severity Classification and Localization</w:t>
+        <w:t xml:space="preserve"> </w:t>
+      </w:r>
+      <w:r>
+        <w:rPr>
+          <w:rFonts w:ascii="Segoe UI Emoji" w:hAnsi="Segoe UI Emoji" w:cs="Segoe UI Emoji"/>
+        </w:rPr>
+        <w:t>🔗</w:t>
       </w:r>
       <w:r>
         <w:rPr>
@@ -836,7 +1065,7 @@
           <w:sz w:val="20"/>
           <w:szCs w:val="24"/>
         </w:rPr>
-        <w:t>2025 – 2026</w:t>
+        <w:t>2025</w:t>
       </w:r>
     </w:p>
     <w:p>
@@ -854,7 +1083,7 @@
           <w:sz w:val="18"/>
           <w:szCs w:val="24"/>
         </w:rPr>
-        <w:t>Python | TensorFlow/Keras | YOLO | OpenCV | FastAPI | Computer Vision</w:t>
+        <w:t>Python | Speech Recognition | LLM APIs | Automation Libraries</w:t>
       </w:r>
     </w:p>
     <w:p>
@@ -873,7 +1102,7 @@
           <w:sz w:val="20"/>
           <w:szCs w:val="24"/>
         </w:rPr>
-        <w:t>Developed an end-to-end hybrid deep learning framework integrating YOLO-based object detection with CNN-based severity classification for automated vehicle damage assessment.</w:t>
+        <w:t>Built a voice-controlled AI assistant combining speech recognition with LLM inference for natural language task automation and system-level command execution.</w:t>
       </w:r>
     </w:p>
     <w:p>
@@ -892,26 +1121,7 @@
           <w:sz w:val="20"/>
           <w:szCs w:val="24"/>
         </w:rPr>
-        <w:t>Built the complete ML pipeline including dataset preparation, model training, hyperparameter tuning, evaluation metrics, and a FastAPI inference backend for real-time predictions.</w:t>
-      </w:r>
-    </w:p>
-    <w:p>
-      <w:pPr>
-        <w:pStyle w:val="ListBullet"/>
-        <w:spacing w:after="20"/>
-        <w:ind w:left="283"/>
-        <w:rPr>
-          <w:sz w:val="20"/>
-          <w:szCs w:val="24"/>
-        </w:rPr>
-      </w:pPr>
-      <w:r>
-        <w:rPr>
-          <w:color w:val="2A2A2A"/>
-          <w:sz w:val="20"/>
-          <w:szCs w:val="24"/>
-        </w:rPr>
-        <w:t>Presented the research at the 2026 IEEE International Conference on Natural Language Processing and Computer Vision (ICNPCV), Bengaluru, India.</w:t>
+        <w:t>Engineered a real-time speech-to-LLM-to-action pipeline with modular command processing and dynamic response generation.</w:t>
       </w:r>
     </w:p>
     <w:p>
@@ -931,10 +1141,10 @@
     </w:p>
     <w:p>
       <w:pPr>
-        <w:tabs>
-          <w:tab w:val="right" w:pos="10205"/>
-        </w:tabs>
-        <w:spacing w:before="60"/>
+        <w:pBdr>
+          <w:bottom w:val="single" w:sz="4" w:space="1" w:color="CCCCCC"/>
+        </w:pBdr>
+        <w:spacing w:before="120" w:after="60"/>
         <w:rPr>
           <w:sz w:val="20"/>
           <w:szCs w:val="24"/>
@@ -947,44 +1157,46 @@
           <w:sz w:val="22"/>
           <w:szCs w:val="24"/>
         </w:rPr>
-        <w:t>Vocalix — AI Voice Assistant</w:t>
+        <w:t>PUBLICATIONS</w:t>
       </w:r>
-      <w:r>
+    </w:p>
+    <w:p>
+      <w:pPr>
+        <w:spacing w:before="40"/>
         <w:rPr>
           <w:sz w:val="20"/>
           <w:szCs w:val="24"/>
         </w:rPr>
-        <w:tab/>
+      </w:pPr>
+      <w:r>
+        <w:rPr>
+          <w:b/>
+          <w:sz w:val="20"/>
+          <w:szCs w:val="24"/>
+        </w:rPr>
+        <w:t>A Hybrid CNN–YOLO Framework for Car Damage Severity Classification and Localization</w:t>
       </w:r>
+    </w:p>
+    <w:p>
+      <w:pPr>
+        <w:spacing w:after="20"/>
+        <w:rPr>
+          <w:sz w:val="20"/>
+          <w:szCs w:val="24"/>
+        </w:rPr>
+      </w:pPr>
       <w:r>
         <w:rPr>
+          <w:i/>
           <w:color w:val="555555"/>
           <w:sz w:val="20"/>
           <w:szCs w:val="24"/>
         </w:rPr>
-        <w:t>2025</w:t>
+        <w:t>2026 IEEE International Conference on Natural Language Processing and Computer Vision (ICNPCV), Bengaluru, India</w:t>
       </w:r>
     </w:p>
     <w:p>
       <w:pPr>
-        <w:spacing w:after="40"/>
-        <w:rPr>
-          <w:sz w:val="20"/>
-          <w:szCs w:val="24"/>
-        </w:rPr>
-      </w:pPr>
-      <w:r>
-        <w:rPr>
-          <w:b/>
-          <w:color w:val="1A5276"/>
-          <w:sz w:val="18"/>
-          <w:szCs w:val="24"/>
-        </w:rPr>
-        <w:t>Python | Speech Recognition | LLM APIs | Automation Libraries</w:t>
-      </w:r>
-    </w:p>
-    <w:p>
-      <w:pPr>
         <w:pStyle w:val="ListBullet"/>
         <w:spacing w:after="20"/>
         <w:ind w:left="283"/>
@@ -999,26 +1211,7 @@
           <w:sz w:val="20"/>
           <w:szCs w:val="24"/>
         </w:rPr>
-        <w:t>Built a voice-controlled AI assistant combining speech recognition with LLM inference for natural language task automation and system-level command execution.</w:t>
-      </w:r>
-    </w:p>
-    <w:p>
-      <w:pPr>
-        <w:pStyle w:val="ListBullet"/>
-        <w:spacing w:after="20"/>
-        <w:ind w:left="283"/>
-        <w:rPr>
-          <w:sz w:val="20"/>
-          <w:szCs w:val="24"/>
-        </w:rPr>
-      </w:pPr>
-      <w:r>
-        <w:rPr>
-          <w:color w:val="2A2A2A"/>
-          <w:sz w:val="20"/>
-          <w:szCs w:val="24"/>
-        </w:rPr>
-        <w:t>Engineered a real-time speech-to-LLM-to-action pipeline with modular command processing and dynamic response generation.</w:t>
+        <w:t>Published and presented peer-reviewed research on a hybrid deep learning framework combining YOLO object detection with CNN classification for automated vehicle damage assessment.</w:t>
       </w:r>
     </w:p>
     <w:p>
@@ -1054,85 +1247,17 @@
           <w:sz w:val="22"/>
           <w:szCs w:val="24"/>
         </w:rPr>
-        <w:t>PUBLICATIONS</w:t>
+        <w:t>EDUCATION</w:t>
       </w:r>
     </w:p>
     <w:p>
       <w:pPr>
-        <w:spacing w:before="40"/>
-        <w:rPr>
-          <w:sz w:val="20"/>
-          <w:szCs w:val="24"/>
-        </w:rPr>
-      </w:pPr>
-      <w:r>
-        <w:rPr>
-          <w:b/>
-          <w:sz w:val="20"/>
-          <w:szCs w:val="24"/>
-        </w:rPr>
-        <w:t>A Hybrid CNN–YOLO Framework for Car Damage Severity Classification and Localization</w:t>
-      </w:r>
-    </w:p>
-    <w:p>
-      <w:pPr>
-        <w:spacing w:after="20"/>
-        <w:rPr>
-          <w:sz w:val="20"/>
-          <w:szCs w:val="24"/>
-        </w:rPr>
-      </w:pPr>
-      <w:r>
-        <w:rPr>
-          <w:i/>
+        <w:tabs>
+          <w:tab w:val="right" w:pos="10205"/>
+        </w:tabs>
+        <w:spacing w:before="60"/>
+        <w:rPr>
           <w:color w:val="555555"/>
-          <w:sz w:val="20"/>
-          <w:szCs w:val="24"/>
-        </w:rPr>
-        <w:t>2026 IEEE International Conference on Natural Language Processing and Computer Vision (ICNPCV), Bengaluru, India</w:t>
-      </w:r>
-    </w:p>
-    <w:p>
-      <w:pPr>
-        <w:pStyle w:val="ListBullet"/>
-        <w:spacing w:after="20"/>
-        <w:ind w:left="283"/>
-        <w:rPr>
-          <w:sz w:val="20"/>
-          <w:szCs w:val="24"/>
-        </w:rPr>
-      </w:pPr>
-      <w:r>
-        <w:rPr>
-          <w:color w:val="2A2A2A"/>
-          <w:sz w:val="20"/>
-          <w:szCs w:val="24"/>
-        </w:rPr>
-        <w:t>Published and presented peer-reviewed research on a hybrid deep learning framework combining YOLO object detection with CNN classification for automated vehicle damage assessment.</w:t>
-      </w:r>
-    </w:p>
-    <w:p>
-      <w:pPr>
-        <w:pStyle w:val="ListBullet"/>
-        <w:numPr>
-          <w:ilvl w:val="0"/>
-          <w:numId w:val="0"/>
-        </w:numPr>
-        <w:spacing w:after="20"/>
-        <w:ind w:left="-77"/>
-        <w:rPr>
-          <w:sz w:val="4"/>
-          <w:szCs w:val="4"/>
-        </w:rPr>
-      </w:pPr>
-    </w:p>
-    <w:p>
-      <w:pPr>
-        <w:pBdr>
-          <w:bottom w:val="single" w:sz="4" w:space="1" w:color="CCCCCC"/>
-        </w:pBdr>
-        <w:spacing w:before="120" w:after="60"/>
-        <w:rPr>
           <w:sz w:val="20"/>
           <w:szCs w:val="24"/>
         </w:rPr>
@@ -1144,27 +1269,6 @@
           <w:sz w:val="22"/>
           <w:szCs w:val="24"/>
         </w:rPr>
-        <w:t>EDUCATION</w:t>
-      </w:r>
-    </w:p>
-    <w:p>
-      <w:pPr>
-        <w:tabs>
-          <w:tab w:val="right" w:pos="10205"/>
-        </w:tabs>
-        <w:spacing w:before="60"/>
-        <w:rPr>
-          <w:sz w:val="20"/>
-          <w:szCs w:val="24"/>
-        </w:rPr>
-      </w:pPr>
-      <w:r>
-        <w:rPr>
-          <w:b/>
-          <w:color w:val="0D0D0D"/>
-          <w:sz w:val="22"/>
-          <w:szCs w:val="24"/>
-        </w:rPr>
         <w:t>B.Tech in Artificial Intelligence and Data Science</w:t>
       </w:r>
       <w:r>
@@ -1197,6 +1301,22 @@
           <w:szCs w:val="24"/>
         </w:rPr>
         <w:t>JCT College of Engineering and Technology, Anna University</w:t>
+      </w:r>
+      <w:r>
+        <w:rPr>
+          <w:color w:val="444444"/>
+          <w:sz w:val="20"/>
+          <w:szCs w:val="24"/>
+        </w:rPr>
+        <w:t xml:space="preserve">                                                                                                (</w:t>
+      </w:r>
+      <w:r>
+        <w:rPr>
+          <w:color w:val="444444"/>
+          <w:sz w:val="20"/>
+          <w:szCs w:val="24"/>
+        </w:rPr>
+        <w:t>Graduated)</w:t>
       </w:r>
     </w:p>
     <w:p>
@@ -1540,7 +1660,7 @@
   <w:abstractNum w:abstractNumId="8" w15:restartNumberingAfterBreak="0">
     <w:nsid w:val="FFFFFF89"/>
     <w:multiLevelType w:val="singleLevel"/>
-    <w:tmpl w:val="29761A62"/>
+    <w:tmpl w:val="055880B8"/>
     <w:lvl w:ilvl="0">
       <w:start w:val="1"/>
       <w:numFmt w:val="bullet"/>
@@ -2199,7 +2319,6 @@
   <w:style w:type="character" w:default="1" w:styleId="DefaultParagraphFont">
     <w:name w:val="Default Paragraph Font"/>
     <w:uiPriority w:val="1"/>
-    <w:semiHidden/>
     <w:unhideWhenUsed/>
   </w:style>
   <w:style w:type="table" w:default="1" w:styleId="TableNormal">

</xml_diff>

<commit_message>
resume updated in both word and pdf
</commit_message>
<xml_diff>
--- a/assets/Resume.docx
+++ b/assets/Resume.docx
@@ -23,20 +23,43 @@
     </w:p>
     <w:p>
       <w:pPr>
-        <w:spacing w:after="80"/>
-        <w:jc w:val="center"/>
-        <w:rPr>
-          <w:sz w:val="20"/>
-          <w:szCs w:val="24"/>
-        </w:rPr>
-      </w:pPr>
-      <w:r>
+        <w:tabs>
+          <w:tab w:val="center" w:pos="5270"/>
+        </w:tabs>
+        <w:spacing w:after="120"/>
         <w:rPr>
           <w:color w:val="333333"/>
           <w:sz w:val="22"/>
           <w:szCs w:val="24"/>
         </w:rPr>
-        <w:t>AI Engineer | Machine Learning · LLM Systems · Computer Vision · RAG Pipelines</w:t>
+      </w:pPr>
+      <w:r>
+        <w:rPr>
+          <w:b/>
+          <w:bCs/>
+          <w:color w:val="333333"/>
+          <w:sz w:val="22"/>
+          <w:szCs w:val="24"/>
+        </w:rPr>
+        <w:tab/>
+      </w:r>
+      <w:r>
+        <w:rPr>
+          <w:b/>
+          <w:bCs/>
+          <w:color w:val="333333"/>
+          <w:sz w:val="22"/>
+          <w:szCs w:val="24"/>
+        </w:rPr>
+        <w:t>AI Engineer</w:t>
+      </w:r>
+      <w:r>
+        <w:rPr>
+          <w:color w:val="333333"/>
+          <w:sz w:val="22"/>
+          <w:szCs w:val="24"/>
+        </w:rPr>
+        <w:t> | Computer Vision · LLM Systems · RAG Pipelines · Machine Learning</w:t>
       </w:r>
     </w:p>
     <w:p>
@@ -240,51 +263,33 @@
           <w:sz w:val="20"/>
           <w:szCs w:val="24"/>
         </w:rPr>
-        <w:t xml:space="preserve">AI Engineer Intern building production AI systems spanning Computer Vision, LLM integration, RAG pipelines, and AI workflow orchestration. Currently developing an AI model evaluation and orchestration platform for testing multi-provider LLMs while delivering Computer Vision and Generative AI solutions at </w:t>
-      </w:r>
-      <w:r>
-        <w:rPr>
-          <w:b/>
-          <w:bCs/>
+        <w:t xml:space="preserve">AI Engineer with hands-on production experience in Computer Vision and Generative AI, currently delivering real-world client solutions at </w:t>
+      </w:r>
+      <w:proofErr w:type="spellStart"/>
+      <w:r>
+        <w:rPr>
           <w:color w:val="2A2A2A"/>
           <w:sz w:val="20"/>
           <w:szCs w:val="24"/>
         </w:rPr>
-        <w:t>Difinity Digital</w:t>
-      </w:r>
+        <w:t>Difinity</w:t>
+      </w:r>
+      <w:proofErr w:type="spellEnd"/>
       <w:r>
         <w:rPr>
           <w:color w:val="2A2A2A"/>
           <w:sz w:val="20"/>
           <w:szCs w:val="24"/>
         </w:rPr>
-        <w:t xml:space="preserve">. Published research at </w:t>
-      </w:r>
-      <w:r>
-        <w:rPr>
-          <w:b/>
-          <w:bCs/>
-          <w:color w:val="2A2A2A"/>
-          <w:sz w:val="20"/>
-          <w:szCs w:val="24"/>
-        </w:rPr>
-        <w:t>IEEE ICNPCV 2026</w:t>
-      </w:r>
-      <w:r>
-        <w:rPr>
-          <w:color w:val="2A2A2A"/>
-          <w:sz w:val="20"/>
-          <w:szCs w:val="24"/>
-        </w:rPr>
-        <w:t xml:space="preserve"> on hybrid deep learning frameworks. Passionate about scalable AI infrastructure — from model experimentation to deployment-ready intelligent systems.</w:t>
+        <w:t xml:space="preserve"> Digital. Built and deployed end-to-end CV pipelines using YOLOv26 detection and segmentation models for industrial monitoring, and integrated SAM (Segment Anything Model) into Label Studio to accelerate annotation workflows. Simultaneously building a multi-provider LLM evaluation and orchestration platform with RAG pipelines, memory systems, and SSE streaming. Published researcher at IEEE ICNPCV 2026. Seeking a full-time AI Engineer role to bring production-grade AI engineering skills to challenging problems.</w:t>
       </w:r>
     </w:p>
     <w:p>
       <w:pPr>
         <w:spacing w:after="40"/>
         <w:rPr>
-          <w:sz w:val="4"/>
-          <w:szCs w:val="4"/>
+          <w:sz w:val="2"/>
+          <w:szCs w:val="2"/>
         </w:rPr>
       </w:pPr>
     </w:p>
@@ -320,10 +325,20 @@
       <w:r>
         <w:rPr>
           <w:b/>
+          <w:bCs/>
           <w:sz w:val="20"/>
           <w:szCs w:val="24"/>
         </w:rPr>
-        <w:t xml:space="preserve">AI &amp; Machine Learning:  </w:t>
+        <w:t>Computer Vision</w:t>
+      </w:r>
+      <w:proofErr w:type="gramStart"/>
+      <w:r>
+        <w:rPr>
+          <w:b/>
+          <w:sz w:val="20"/>
+          <w:szCs w:val="24"/>
+        </w:rPr>
+        <w:t xml:space="preserve">:  </w:t>
       </w:r>
       <w:r>
         <w:rPr>
@@ -331,7 +346,16 @@
           <w:sz w:val="20"/>
           <w:szCs w:val="24"/>
         </w:rPr>
-        <w:t>Computer Vision, Deep Learning, CNNs, YOLO, LLM Integration, RAG, Prompt Engineering, Model Evaluation &amp; Benchmarking, AI Workflow Orchestration, Conversational AI</w:t>
+        <w:t>YOLOv26</w:t>
+      </w:r>
+      <w:proofErr w:type="gramEnd"/>
+      <w:r>
+        <w:rPr>
+          <w:color w:val="333333"/>
+          <w:sz w:val="20"/>
+          <w:szCs w:val="24"/>
+        </w:rPr>
+        <w:t xml:space="preserve"> (Nano/Small/Medium/Large), YOLOv26-Seg, SAM (Segment Anything Model), CNNs, Object Detection, Instance Segmentation, Image Classification, Model Benchmarking</w:t>
       </w:r>
     </w:p>
     <w:p>
@@ -348,7 +372,16 @@
           <w:sz w:val="20"/>
           <w:szCs w:val="24"/>
         </w:rPr>
-        <w:t xml:space="preserve">LLM &amp; Generative AI:  </w:t>
+        <w:t>LLM &amp; Generative AI</w:t>
+      </w:r>
+      <w:proofErr w:type="gramStart"/>
+      <w:r>
+        <w:rPr>
+          <w:b/>
+          <w:sz w:val="20"/>
+          <w:szCs w:val="24"/>
+        </w:rPr>
+        <w:t xml:space="preserve">:  </w:t>
       </w:r>
       <w:r>
         <w:rPr>
@@ -356,15 +389,16 @@
           <w:sz w:val="20"/>
           <w:szCs w:val="24"/>
         </w:rPr>
-        <w:t>Commercial LLM APIs (Gemini, OpenAI, NVIDIA)</w:t>
-      </w:r>
+        <w:t>LLM</w:t>
+      </w:r>
+      <w:proofErr w:type="gramEnd"/>
       <w:r>
         <w:rPr>
           <w:color w:val="333333"/>
           <w:sz w:val="20"/>
           <w:szCs w:val="24"/>
         </w:rPr>
-        <w:t>, SSE Streaming, AI Memory Systems</w:t>
+        <w:t xml:space="preserve"> APIs (Gemini, OpenAI, NVIDIA), RAG Pipelines, Prompt Engineering, SSE Streaming, AI Memory Systems, Embedding Models, Retrieval Systems, Conversational AI</w:t>
       </w:r>
     </w:p>
     <w:p>
@@ -381,15 +415,125 @@
           <w:sz w:val="20"/>
           <w:szCs w:val="24"/>
         </w:rPr>
-        <w:t xml:space="preserve">Frameworks &amp; Libraries:  </w:t>
-      </w:r>
+        <w:t>Frameworks &amp; Libraries</w:t>
+      </w:r>
+      <w:proofErr w:type="gramStart"/>
+      <w:r>
+        <w:rPr>
+          <w:b/>
+          <w:sz w:val="20"/>
+          <w:szCs w:val="24"/>
+        </w:rPr>
+        <w:t xml:space="preserve">:  </w:t>
+      </w:r>
+      <w:proofErr w:type="spellStart"/>
       <w:r>
         <w:rPr>
           <w:color w:val="333333"/>
           <w:sz w:val="20"/>
           <w:szCs w:val="24"/>
         </w:rPr>
-        <w:t>TensorFlow/Keras, PyTorch, OpenCV, FastAPI, Flask, SQLAlchemy, Pydantic, NumPy, Pandas</w:t>
+        <w:t>PyTorch</w:t>
+      </w:r>
+      <w:proofErr w:type="spellEnd"/>
+      <w:proofErr w:type="gramEnd"/>
+      <w:r>
+        <w:rPr>
+          <w:color w:val="333333"/>
+          <w:sz w:val="20"/>
+          <w:szCs w:val="24"/>
+        </w:rPr>
+        <w:t>, TensorFlow/</w:t>
+      </w:r>
+      <w:proofErr w:type="spellStart"/>
+      <w:r>
+        <w:rPr>
+          <w:color w:val="333333"/>
+          <w:sz w:val="20"/>
+          <w:szCs w:val="24"/>
+        </w:rPr>
+        <w:t>Keras</w:t>
+      </w:r>
+      <w:proofErr w:type="spellEnd"/>
+      <w:r>
+        <w:rPr>
+          <w:color w:val="333333"/>
+          <w:sz w:val="20"/>
+          <w:szCs w:val="24"/>
+        </w:rPr>
+        <w:t xml:space="preserve">, OpenCV, </w:t>
+      </w:r>
+      <w:proofErr w:type="spellStart"/>
+      <w:r>
+        <w:rPr>
+          <w:color w:val="333333"/>
+          <w:sz w:val="20"/>
+          <w:szCs w:val="24"/>
+        </w:rPr>
+        <w:t>Ultralytics</w:t>
+      </w:r>
+      <w:proofErr w:type="spellEnd"/>
+      <w:r>
+        <w:rPr>
+          <w:color w:val="333333"/>
+          <w:sz w:val="20"/>
+          <w:szCs w:val="24"/>
+        </w:rPr>
+        <w:t xml:space="preserve">, </w:t>
+      </w:r>
+      <w:proofErr w:type="spellStart"/>
+      <w:r>
+        <w:rPr>
+          <w:color w:val="333333"/>
+          <w:sz w:val="20"/>
+          <w:szCs w:val="24"/>
+        </w:rPr>
+        <w:t>FastAPI</w:t>
+      </w:r>
+      <w:proofErr w:type="spellEnd"/>
+      <w:r>
+        <w:rPr>
+          <w:color w:val="333333"/>
+          <w:sz w:val="20"/>
+          <w:szCs w:val="24"/>
+        </w:rPr>
+        <w:t xml:space="preserve">, Flask, </w:t>
+      </w:r>
+      <w:proofErr w:type="spellStart"/>
+      <w:r>
+        <w:rPr>
+          <w:color w:val="333333"/>
+          <w:sz w:val="20"/>
+          <w:szCs w:val="24"/>
+        </w:rPr>
+        <w:t>SQLAlchemy</w:t>
+      </w:r>
+      <w:proofErr w:type="spellEnd"/>
+      <w:r>
+        <w:rPr>
+          <w:color w:val="333333"/>
+          <w:sz w:val="20"/>
+          <w:szCs w:val="24"/>
+        </w:rPr>
+        <w:t xml:space="preserve">, </w:t>
+      </w:r>
+      <w:proofErr w:type="spellStart"/>
+      <w:r>
+        <w:rPr>
+          <w:color w:val="333333"/>
+          <w:sz w:val="20"/>
+          <w:szCs w:val="24"/>
+        </w:rPr>
+        <w:t>Pydantic</w:t>
+      </w:r>
+      <w:proofErr w:type="spellEnd"/>
+      <w:r>
+        <w:rPr>
+          <w:color w:val="333333"/>
+          <w:sz w:val="20"/>
+          <w:szCs w:val="24"/>
+        </w:rPr>
+        <w:t>, NumPy, Pandas, Label Studio</w:t>
       </w:r>
     </w:p>
     <w:p>
@@ -406,7 +550,16 @@
           <w:sz w:val="20"/>
           <w:szCs w:val="24"/>
         </w:rPr>
-        <w:t xml:space="preserve">Infrastructure &amp; Tools:  </w:t>
+        <w:t>Infrastructure &amp; Tools</w:t>
+      </w:r>
+      <w:proofErr w:type="gramStart"/>
+      <w:r>
+        <w:rPr>
+          <w:b/>
+          <w:sz w:val="20"/>
+          <w:szCs w:val="24"/>
+        </w:rPr>
+        <w:t xml:space="preserve">:  </w:t>
       </w:r>
       <w:r>
         <w:rPr>
@@ -414,7 +567,34 @@
           <w:sz w:val="20"/>
           <w:szCs w:val="24"/>
         </w:rPr>
-        <w:t>Python, SQL, Docker, Docker Compose, Git, Linux, PostgreSQL, VS Code, Jupyter Notebook</w:t>
+        <w:t>Python</w:t>
+      </w:r>
+      <w:proofErr w:type="gramEnd"/>
+      <w:r>
+        <w:rPr>
+          <w:color w:val="333333"/>
+          <w:sz w:val="20"/>
+          <w:szCs w:val="24"/>
+        </w:rPr>
+        <w:t xml:space="preserve">, SQL, Docker, Docker Compose, Git, Linux, PostgreSQL, </w:t>
+      </w:r>
+      <w:proofErr w:type="spellStart"/>
+      <w:r>
+        <w:rPr>
+          <w:color w:val="333333"/>
+          <w:sz w:val="20"/>
+          <w:szCs w:val="24"/>
+        </w:rPr>
+        <w:t>pgvector</w:t>
+      </w:r>
+      <w:proofErr w:type="spellEnd"/>
+      <w:r>
+        <w:rPr>
+          <w:color w:val="333333"/>
+          <w:sz w:val="20"/>
+          <w:szCs w:val="24"/>
+        </w:rPr>
+        <w:t>, VS Code, Jupyter Notebook</w:t>
       </w:r>
     </w:p>
     <w:p>
@@ -432,7 +612,16 @@
           <w:sz w:val="20"/>
           <w:szCs w:val="24"/>
         </w:rPr>
-        <w:t xml:space="preserve">Cloud &amp; Platforms:  </w:t>
+        <w:t>Cloud &amp; Platforms</w:t>
+      </w:r>
+      <w:proofErr w:type="gramStart"/>
+      <w:r>
+        <w:rPr>
+          <w:b/>
+          <w:sz w:val="20"/>
+          <w:szCs w:val="24"/>
+        </w:rPr>
+        <w:t xml:space="preserve">:  </w:t>
       </w:r>
       <w:r>
         <w:rPr>
@@ -440,7 +629,16 @@
           <w:sz w:val="20"/>
           <w:szCs w:val="24"/>
         </w:rPr>
-        <w:t>Oracle Cloud Infrastructure (OCI AI Foundations), AWS Fundamentals, Google AI Essentials</w:t>
+        <w:t>Oracle</w:t>
+      </w:r>
+      <w:proofErr w:type="gramEnd"/>
+      <w:r>
+        <w:rPr>
+          <w:color w:val="333333"/>
+          <w:sz w:val="20"/>
+          <w:szCs w:val="24"/>
+        </w:rPr>
+        <w:t xml:space="preserve"> Cloud Infrastructure (AI Foundations Associate), AWS Fundamentals, Google AI Essentials</w:t>
       </w:r>
     </w:p>
     <w:p>
@@ -448,8 +646,8 @@
         <w:spacing w:before="20" w:after="20"/>
         <w:rPr>
           <w:color w:val="333333"/>
-          <w:sz w:val="4"/>
-          <w:szCs w:val="4"/>
+          <w:sz w:val="2"/>
+          <w:szCs w:val="2"/>
         </w:rPr>
       </w:pPr>
     </w:p>
@@ -492,7 +690,27 @@
           <w:sz w:val="22"/>
           <w:szCs w:val="24"/>
         </w:rPr>
-        <w:t>AI Engineer Intern — Difinity Digital</w:t>
+        <w:t xml:space="preserve">AI Engineer Intern — </w:t>
+      </w:r>
+      <w:proofErr w:type="spellStart"/>
+      <w:r>
+        <w:rPr>
+          <w:b/>
+          <w:color w:val="0D0D0D"/>
+          <w:sz w:val="22"/>
+          <w:szCs w:val="24"/>
+        </w:rPr>
+        <w:t>Difinity</w:t>
+      </w:r>
+      <w:proofErr w:type="spellEnd"/>
+      <w:r>
+        <w:rPr>
+          <w:b/>
+          <w:color w:val="0D0D0D"/>
+          <w:sz w:val="22"/>
+          <w:szCs w:val="24"/>
+        </w:rPr>
+        <w:t xml:space="preserve"> Digital</w:t>
       </w:r>
       <w:r>
         <w:rPr>
@@ -507,7 +725,23 @@
           <w:sz w:val="20"/>
           <w:szCs w:val="24"/>
         </w:rPr>
-        <w:t>06/2026 – Present</w:t>
+        <w:t>Jun 2026</w:t>
+      </w:r>
+      <w:r>
+        <w:rPr>
+          <w:color w:val="555555"/>
+          <w:sz w:val="20"/>
+          <w:szCs w:val="24"/>
+        </w:rPr>
+        <w:t xml:space="preserve"> – </w:t>
+      </w:r>
+      <w:r>
+        <w:rPr>
+          <w:color w:val="555555"/>
+          <w:sz w:val="20"/>
+          <w:szCs w:val="24"/>
+        </w:rPr>
+        <w:t>Sep 2026</w:t>
       </w:r>
     </w:p>
     <w:p>
@@ -520,87 +754,14 @@
       </w:pPr>
       <w:r>
         <w:rPr>
+          <w:b/>
+          <w:bCs/>
           <w:i/>
           <w:color w:val="555555"/>
           <w:sz w:val="20"/>
           <w:szCs w:val="24"/>
         </w:rPr>
         <w:t>Kochi, Kerala</w:t>
-      </w:r>
-    </w:p>
-    <w:p>
-      <w:pPr>
-        <w:pStyle w:val="ListBullet"/>
-        <w:spacing w:after="20"/>
-        <w:ind w:left="283"/>
-        <w:rPr>
-          <w:sz w:val="20"/>
-          <w:szCs w:val="24"/>
-        </w:rPr>
-      </w:pPr>
-      <w:r>
-        <w:rPr>
-          <w:color w:val="2A2A2A"/>
-          <w:sz w:val="20"/>
-          <w:szCs w:val="24"/>
-        </w:rPr>
-        <w:t xml:space="preserve">Developing AI-powered applications using Python, FastAPI, and REST APIs for real-world client deployments. Internship concludes </w:t>
-      </w:r>
-      <w:r>
-        <w:rPr>
-          <w:b/>
-          <w:bCs/>
-          <w:color w:val="2A2A2A"/>
-          <w:sz w:val="20"/>
-          <w:szCs w:val="24"/>
-        </w:rPr>
-        <w:t>September 8, 2026</w:t>
-      </w:r>
-      <w:r>
-        <w:rPr>
-          <w:color w:val="2A2A2A"/>
-          <w:sz w:val="20"/>
-          <w:szCs w:val="24"/>
-        </w:rPr>
-        <w:t>.</w:t>
-      </w:r>
-    </w:p>
-    <w:p>
-      <w:pPr>
-        <w:pStyle w:val="ListBullet"/>
-        <w:spacing w:after="20"/>
-        <w:ind w:left="283"/>
-        <w:rPr>
-          <w:sz w:val="20"/>
-          <w:szCs w:val="24"/>
-        </w:rPr>
-      </w:pPr>
-      <w:r>
-        <w:rPr>
-          <w:color w:val="2A2A2A"/>
-          <w:sz w:val="20"/>
-          <w:szCs w:val="24"/>
-        </w:rPr>
-        <w:t>Building Computer Vision solutions and Generative AI integrations including LLM-based workflow automation.</w:t>
-      </w:r>
-    </w:p>
-    <w:p>
-      <w:pPr>
-        <w:pStyle w:val="ListBullet"/>
-        <w:spacing w:after="20"/>
-        <w:ind w:left="283"/>
-        <w:rPr>
-          <w:sz w:val="20"/>
-          <w:szCs w:val="24"/>
-        </w:rPr>
-      </w:pPr>
-      <w:r>
-        <w:rPr>
-          <w:color w:val="2A2A2A"/>
-          <w:sz w:val="20"/>
-          <w:szCs w:val="24"/>
-        </w:rPr>
-        <w:t>Designing production-ready backend services and AI inference pipelines while collaborating with cross-functional engineering teams.</w:t>
       </w:r>
     </w:p>
     <w:p>
@@ -611,238 +772,212 @@
           <w:numId w:val="0"/>
         </w:numPr>
         <w:spacing w:after="20"/>
-        <w:ind w:left="-77"/>
-        <w:rPr>
-          <w:sz w:val="4"/>
-          <w:szCs w:val="4"/>
-        </w:rPr>
-      </w:pPr>
+        <w:ind w:left="360" w:hanging="360"/>
+        <w:rPr>
+          <w:sz w:val="20"/>
+          <w:szCs w:val="24"/>
+        </w:rPr>
+      </w:pPr>
+      <w:r>
+        <w:rPr>
+          <w:b/>
+          <w:bCs/>
+          <w:sz w:val="20"/>
+          <w:szCs w:val="24"/>
+        </w:rPr>
+        <w:t>Computer Vision — Industrial Monitoring System (Client Project)</w:t>
+      </w:r>
     </w:p>
     <w:p>
       <w:pPr>
-        <w:pBdr>
-          <w:bottom w:val="single" w:sz="4" w:space="1" w:color="CCCCCC"/>
-        </w:pBdr>
-        <w:spacing w:before="120" w:after="60"/>
-        <w:rPr>
-          <w:b/>
-          <w:color w:val="0D0D0D"/>
-          <w:sz w:val="22"/>
-          <w:szCs w:val="24"/>
-        </w:rPr>
-      </w:pPr>
-      <w:r>
-        <w:rPr>
-          <w:b/>
-          <w:color w:val="0D0D0D"/>
-          <w:sz w:val="22"/>
-          <w:szCs w:val="24"/>
-        </w:rPr>
-        <w:t>PROJECTS</w:t>
+        <w:pStyle w:val="ListBullet"/>
+        <w:numPr>
+          <w:ilvl w:val="0"/>
+          <w:numId w:val="11"/>
+        </w:numPr>
+        <w:tabs>
+          <w:tab w:val="clear" w:pos="720"/>
+          <w:tab w:val="num" w:pos="360"/>
+        </w:tabs>
+        <w:spacing w:after="20"/>
+        <w:ind w:left="142" w:hanging="142"/>
+        <w:rPr>
+          <w:lang w:val="en-IN" w:eastAsia="en-IN"/>
+        </w:rPr>
+      </w:pPr>
+      <w:r>
+        <w:rPr>
+          <w:lang w:val="en-IN" w:eastAsia="en-IN"/>
+        </w:rPr>
+        <w:t>Delivered production Computer Vision solutions across 2 sprints for a real-world client project focused on industrial monitoring and automation.</w:t>
       </w:r>
     </w:p>
     <w:p>
       <w:pPr>
+        <w:pStyle w:val="ListBullet"/>
+        <w:numPr>
+          <w:ilvl w:val="0"/>
+          <w:numId w:val="11"/>
+        </w:numPr>
         <w:tabs>
-          <w:tab w:val="right" w:pos="10205"/>
+          <w:tab w:val="clear" w:pos="720"/>
+          <w:tab w:val="num" w:pos="360"/>
         </w:tabs>
-        <w:spacing w:before="60"/>
-        <w:rPr>
-          <w:sz w:val="20"/>
-          <w:szCs w:val="24"/>
-        </w:rPr>
-      </w:pPr>
-      <w:hyperlink r:id="rId11" w:history="1">
-        <w:r>
-          <w:rPr>
-            <w:rStyle w:val="Hyperlink"/>
-            <w:b/>
-            <w:color w:val="auto"/>
-            <w:sz w:val="22"/>
-            <w:szCs w:val="24"/>
-            <w:u w:val="none"/>
-          </w:rPr>
-          <w:t>OpenMind AI Platform — AI Model Evaluation &amp; LLM Orchestration Platform</w:t>
-        </w:r>
-      </w:hyperlink>
+        <w:spacing w:after="20"/>
+        <w:ind w:left="142" w:hanging="142"/>
+        <w:rPr>
+          <w:lang w:val="en-IN" w:eastAsia="en-IN"/>
+        </w:rPr>
+      </w:pPr>
       <w:r>
         <w:rPr>
           <w:b/>
-          <w:color w:val="auto"/>
-          <w:sz w:val="22"/>
-          <w:szCs w:val="24"/>
-        </w:rPr>
-        <w:t xml:space="preserve"> </w:t>
-      </w:r>
-      <w:r>
-        <w:rPr>
-          <w:rFonts w:ascii="Segoe UI Emoji" w:hAnsi="Segoe UI Emoji" w:cs="Segoe UI Emoji"/>
-        </w:rPr>
-        <w:t>🔗</w:t>
-      </w:r>
-      <w:r>
-        <w:rPr>
-          <w:b/>
-          <w:color w:val="0E6B0E"/>
-          <w:sz w:val="16"/>
-          <w:szCs w:val="24"/>
-        </w:rPr>
-        <w:t xml:space="preserve">  ONGOING</w:t>
-      </w:r>
-      <w:r>
-        <w:rPr>
-          <w:sz w:val="20"/>
-          <w:szCs w:val="24"/>
-        </w:rPr>
-        <w:tab/>
-      </w:r>
-      <w:r>
-        <w:rPr>
-          <w:color w:val="555555"/>
-          <w:sz w:val="20"/>
-          <w:szCs w:val="24"/>
-        </w:rPr>
-        <w:t>07/2026 – Present</w:t>
+          <w:bCs/>
+          <w:lang w:val="en-IN" w:eastAsia="en-IN"/>
+        </w:rPr>
+        <w:t>Sprint 1:</w:t>
+      </w:r>
+      <w:r>
+        <w:rPr>
+          <w:lang w:val="en-IN" w:eastAsia="en-IN"/>
+        </w:rPr>
+        <w:t> Built object detection pipelines using YOLOv26 models (Nano, Small, Medium, Large variants) for use cases including sack detection, conveyor belt movement detection, and static time monitoring.</w:t>
       </w:r>
     </w:p>
     <w:p>
       <w:pPr>
-        <w:spacing w:after="40"/>
-        <w:rPr>
-          <w:sz w:val="20"/>
-          <w:szCs w:val="24"/>
+        <w:pStyle w:val="ListBullet"/>
+        <w:numPr>
+          <w:ilvl w:val="0"/>
+          <w:numId w:val="11"/>
+        </w:numPr>
+        <w:tabs>
+          <w:tab w:val="clear" w:pos="720"/>
+          <w:tab w:val="num" w:pos="360"/>
+        </w:tabs>
+        <w:spacing w:after="20"/>
+        <w:ind w:left="142" w:hanging="142"/>
+        <w:rPr>
+          <w:lang w:val="en-IN" w:eastAsia="en-IN"/>
         </w:rPr>
       </w:pPr>
       <w:r>
         <w:rPr>
           <w:b/>
-          <w:color w:val="1A5276"/>
-          <w:sz w:val="18"/>
-          <w:szCs w:val="24"/>
-        </w:rPr>
-        <w:t>Python | FastAPI | Gemini AI | LLM APIs | RAG | pgvector | SQLAlchemy | Docker | PostgreSQL</w:t>
+          <w:bCs/>
+          <w:lang w:val="en-IN" w:eastAsia="en-IN"/>
+        </w:rPr>
+        <w:t>Sprint 2:</w:t>
+      </w:r>
+      <w:r>
+        <w:rPr>
+          <w:lang w:val="en-IN" w:eastAsia="en-IN"/>
+        </w:rPr>
+        <w:t xml:space="preserve"> Migrated the pipeline from detection to YOLOv26-Seg segmentation models, benchmarked multiple model variants for accuracy-latency </w:t>
+      </w:r>
+      <w:proofErr w:type="spellStart"/>
+      <w:r>
+        <w:rPr>
+          <w:lang w:val="en-IN" w:eastAsia="en-IN"/>
+        </w:rPr>
+        <w:t>tradeoffs</w:t>
+      </w:r>
+      <w:proofErr w:type="spellEnd"/>
+      <w:r>
+        <w:rPr>
+          <w:lang w:val="en-IN" w:eastAsia="en-IN"/>
+        </w:rPr>
+        <w:t>, and selected optimal configurations for production deployment.</w:t>
       </w:r>
     </w:p>
     <w:p>
       <w:pPr>
         <w:pStyle w:val="ListBullet"/>
+        <w:numPr>
+          <w:ilvl w:val="0"/>
+          <w:numId w:val="11"/>
+        </w:numPr>
+        <w:tabs>
+          <w:tab w:val="clear" w:pos="720"/>
+          <w:tab w:val="num" w:pos="360"/>
+        </w:tabs>
         <w:spacing w:after="20"/>
-        <w:ind w:left="283"/>
-        <w:rPr>
-          <w:sz w:val="20"/>
-          <w:szCs w:val="24"/>
-        </w:rPr>
-      </w:pPr>
-      <w:r>
-        <w:rPr>
-          <w:color w:val="2A2A2A"/>
-          <w:sz w:val="20"/>
-          <w:szCs w:val="24"/>
-        </w:rPr>
-        <w:t>Building an AI model evaluation platform to test, compare, and benchmark LLMs across API-driven providers (Gemini, GPT-4o) with planned expansion to locally-hosted open-weight models (Llama 3, DeepSeek R1) via Ollama/vLLM.</w:t>
+        <w:ind w:left="142" w:hanging="142"/>
+        <w:rPr>
+          <w:lang w:val="en-IN" w:eastAsia="en-IN"/>
+        </w:rPr>
+      </w:pPr>
+      <w:r>
+        <w:rPr>
+          <w:lang w:val="en-IN" w:eastAsia="en-IN"/>
+        </w:rPr>
+        <w:t>Integrated Meta's </w:t>
+      </w:r>
+      <w:r>
+        <w:rPr>
+          <w:b/>
+          <w:bCs/>
+          <w:lang w:val="en-IN" w:eastAsia="en-IN"/>
+        </w:rPr>
+        <w:t>SAM (Segment Anything Model) into Label Studio</w:t>
+      </w:r>
+      <w:r>
+        <w:rPr>
+          <w:lang w:val="en-IN" w:eastAsia="en-IN"/>
+        </w:rPr>
+        <w:t xml:space="preserve">, building a custom backend that enabled one-click segmentation </w:t>
+      </w:r>
+      <w:proofErr w:type="spellStart"/>
+      <w:r>
+        <w:rPr>
+          <w:lang w:val="en-IN" w:eastAsia="en-IN"/>
+        </w:rPr>
+        <w:t>labeling</w:t>
+      </w:r>
+      <w:proofErr w:type="spellEnd"/>
+      <w:r>
+        <w:rPr>
+          <w:lang w:val="en-IN" w:eastAsia="en-IN"/>
+        </w:rPr>
+        <w:t xml:space="preserve"> — significantly reducing annotation time for the data </w:t>
+      </w:r>
+      <w:proofErr w:type="spellStart"/>
+      <w:r>
+        <w:rPr>
+          <w:lang w:val="en-IN" w:eastAsia="en-IN"/>
+        </w:rPr>
+        <w:t>labeling</w:t>
+      </w:r>
+      <w:proofErr w:type="spellEnd"/>
+      <w:r>
+        <w:rPr>
+          <w:lang w:val="en-IN" w:eastAsia="en-IN"/>
+        </w:rPr>
+        <w:t xml:space="preserve"> team.</w:t>
       </w:r>
     </w:p>
     <w:p>
       <w:pPr>
         <w:pStyle w:val="ListBullet"/>
+        <w:numPr>
+          <w:ilvl w:val="0"/>
+          <w:numId w:val="11"/>
+        </w:numPr>
+        <w:tabs>
+          <w:tab w:val="clear" w:pos="720"/>
+          <w:tab w:val="num" w:pos="360"/>
+        </w:tabs>
         <w:spacing w:after="20"/>
-        <w:ind w:left="283"/>
-        <w:rPr>
-          <w:sz w:val="20"/>
-          <w:szCs w:val="24"/>
-        </w:rPr>
-      </w:pPr>
-      <w:r>
-        <w:rPr>
-          <w:color w:val="2A2A2A"/>
-          <w:sz w:val="20"/>
-          <w:szCs w:val="24"/>
-        </w:rPr>
-        <w:t>Designed a multi-session AI playground with configurable inference parameters (temperature, top_p, max_tokens, system prompts) and real-time SSE streaming for interactive model response evaluation.</w:t>
-      </w:r>
-    </w:p>
-    <w:p>
-      <w:pPr>
-        <w:pStyle w:val="ListBullet"/>
-        <w:spacing w:after="20"/>
-        <w:ind w:left="283"/>
-        <w:rPr>
-          <w:sz w:val="20"/>
-          <w:szCs w:val="24"/>
-        </w:rPr>
-      </w:pPr>
-      <w:r>
-        <w:rPr>
-          <w:color w:val="2A2A2A"/>
-          <w:sz w:val="20"/>
-          <w:szCs w:val="24"/>
-        </w:rPr>
-        <w:t>Engineered the foundation for a RAG pipeline featuring PDF/Markdown document ingestion and text chunking, and currently architecting the pgvector infrastructure for upcoming semantic knowledge retrieval</w:t>
-      </w:r>
-      <w:r>
-        <w:rPr>
-          <w:color w:val="2A2A2A"/>
-          <w:sz w:val="20"/>
-          <w:szCs w:val="24"/>
-        </w:rPr>
-        <w:t>.</w:t>
-      </w:r>
-    </w:p>
-    <w:p>
-      <w:pPr>
-        <w:pStyle w:val="ListBullet"/>
-        <w:spacing w:after="20"/>
-        <w:ind w:left="283"/>
-        <w:rPr>
-          <w:sz w:val="20"/>
-          <w:szCs w:val="24"/>
-        </w:rPr>
-      </w:pPr>
-      <w:r>
-        <w:rPr>
-          <w:color w:val="2A2A2A"/>
-          <w:sz w:val="20"/>
-          <w:szCs w:val="24"/>
-        </w:rPr>
-        <w:t>Architecting a graph-based multi-tier memory system (Conversation, Semantic, Long-Term) to enable persistent AI context across sessions — a core building block for agentic AI applications.</w:t>
-      </w:r>
-    </w:p>
-    <w:p>
-      <w:pPr>
-        <w:pStyle w:val="ListBullet"/>
-        <w:spacing w:after="20"/>
-        <w:ind w:left="283"/>
-        <w:rPr>
-          <w:sz w:val="20"/>
-          <w:szCs w:val="24"/>
-        </w:rPr>
-      </w:pPr>
-      <w:r>
-        <w:rPr>
-          <w:color w:val="2A2A2A"/>
-          <w:sz w:val="20"/>
-          <w:szCs w:val="24"/>
-        </w:rPr>
-        <w:t>Designed the architecture and simulation model for a multi-step AI workflow orchestration engine, paving the way for automated LLM routing, conditional branching, and API integration.</w:t>
-      </w:r>
-    </w:p>
-    <w:p>
-      <w:pPr>
-        <w:pStyle w:val="ListBullet"/>
-        <w:spacing w:after="20"/>
-        <w:ind w:left="283"/>
-        <w:rPr>
-          <w:sz w:val="20"/>
-          <w:szCs w:val="24"/>
-        </w:rPr>
-      </w:pPr>
-      <w:r>
-        <w:rPr>
-          <w:color w:val="2A2A2A"/>
-          <w:sz w:val="20"/>
-          <w:szCs w:val="24"/>
-        </w:rPr>
-        <w:t>Engineered an OpenAI-compatible API gateway with Bearer token authentication, enabling standardized model inference routing across 40+ API endpoints with structured logging and monitoring.</w:t>
+        <w:ind w:left="142" w:hanging="142"/>
+        <w:rPr>
+          <w:lang w:val="en-IN" w:eastAsia="en-IN"/>
+        </w:rPr>
+      </w:pPr>
+      <w:r>
+        <w:rPr>
+          <w:lang w:val="en-IN" w:eastAsia="en-IN"/>
+        </w:rPr>
+        <w:t>Engineered solutions for multiple industrial use cases: sack counting, belt movement tracking, static object duration monitoring, and zone-based activity detection.</w:t>
       </w:r>
     </w:p>
     <w:p>
@@ -853,12 +988,160 @@
           <w:numId w:val="0"/>
         </w:numPr>
         <w:spacing w:after="20"/>
-        <w:ind w:left="-77"/>
-        <w:rPr>
-          <w:sz w:val="20"/>
-          <w:szCs w:val="24"/>
-        </w:rPr>
-      </w:pPr>
+        <w:ind w:left="360" w:hanging="360"/>
+        <w:rPr>
+          <w:sz w:val="2"/>
+          <w:szCs w:val="2"/>
+          <w:lang w:val="en-IN" w:eastAsia="en-IN"/>
+        </w:rPr>
+      </w:pPr>
+    </w:p>
+    <w:p>
+      <w:pPr>
+        <w:pStyle w:val="ListBullet"/>
+        <w:numPr>
+          <w:ilvl w:val="0"/>
+          <w:numId w:val="0"/>
+        </w:numPr>
+        <w:spacing w:after="20"/>
+        <w:ind w:left="360" w:hanging="360"/>
+        <w:rPr>
+          <w:b/>
+          <w:bCs/>
+          <w:lang w:eastAsia="en-IN"/>
+        </w:rPr>
+      </w:pPr>
+      <w:r>
+        <w:rPr>
+          <w:b/>
+          <w:bCs/>
+          <w:lang w:eastAsia="en-IN"/>
+        </w:rPr>
+        <w:t>Generative AI &amp; Backend Engineering</w:t>
+      </w:r>
+    </w:p>
+    <w:p>
+      <w:pPr>
+        <w:pStyle w:val="ListBullet"/>
+        <w:numPr>
+          <w:ilvl w:val="0"/>
+          <w:numId w:val="12"/>
+        </w:numPr>
+        <w:tabs>
+          <w:tab w:val="clear" w:pos="720"/>
+          <w:tab w:val="num" w:pos="142"/>
+        </w:tabs>
+        <w:spacing w:after="20"/>
+        <w:ind w:hanging="720"/>
+        <w:rPr>
+          <w:lang w:val="en-IN" w:eastAsia="en-IN"/>
+        </w:rPr>
+      </w:pPr>
+      <w:r>
+        <w:rPr>
+          <w:lang w:val="en-IN" w:eastAsia="en-IN"/>
+        </w:rPr>
+        <w:t xml:space="preserve">Developed AI-powered backend services using Python, </w:t>
+      </w:r>
+      <w:proofErr w:type="spellStart"/>
+      <w:r>
+        <w:rPr>
+          <w:lang w:val="en-IN" w:eastAsia="en-IN"/>
+        </w:rPr>
+        <w:t>FastAPI</w:t>
+      </w:r>
+      <w:proofErr w:type="spellEnd"/>
+      <w:r>
+        <w:rPr>
+          <w:lang w:val="en-IN" w:eastAsia="en-IN"/>
+        </w:rPr>
+        <w:t>, and REST APIs for client-facing deployments.</w:t>
+      </w:r>
+    </w:p>
+    <w:p>
+      <w:pPr>
+        <w:pStyle w:val="ListBullet"/>
+        <w:numPr>
+          <w:ilvl w:val="0"/>
+          <w:numId w:val="12"/>
+        </w:numPr>
+        <w:tabs>
+          <w:tab w:val="clear" w:pos="720"/>
+          <w:tab w:val="num" w:pos="142"/>
+        </w:tabs>
+        <w:spacing w:after="20"/>
+        <w:ind w:hanging="720"/>
+        <w:rPr>
+          <w:lang w:val="en-IN" w:eastAsia="en-IN"/>
+        </w:rPr>
+      </w:pPr>
+      <w:r>
+        <w:rPr>
+          <w:lang w:val="en-IN" w:eastAsia="en-IN"/>
+        </w:rPr>
+        <w:t>Built LLM-based workflow automation and Generative AI integrations for internal tooling and client applications.</w:t>
+      </w:r>
+    </w:p>
+    <w:p>
+      <w:pPr>
+        <w:pStyle w:val="ListBullet"/>
+        <w:numPr>
+          <w:ilvl w:val="0"/>
+          <w:numId w:val="12"/>
+        </w:numPr>
+        <w:tabs>
+          <w:tab w:val="clear" w:pos="720"/>
+          <w:tab w:val="num" w:pos="142"/>
+        </w:tabs>
+        <w:spacing w:after="20"/>
+        <w:ind w:hanging="720"/>
+        <w:rPr>
+          <w:lang w:val="en-IN" w:eastAsia="en-IN"/>
+        </w:rPr>
+      </w:pPr>
+      <w:r>
+        <w:rPr>
+          <w:lang w:val="en-IN" w:eastAsia="en-IN"/>
+        </w:rPr>
+        <w:t>Collaborated with cross-functional engineering teams on architecture decisions, code reviews, and sprint planning.</w:t>
+      </w:r>
+    </w:p>
+    <w:p>
+      <w:pPr>
+        <w:pStyle w:val="ListBullet"/>
+        <w:numPr>
+          <w:ilvl w:val="0"/>
+          <w:numId w:val="0"/>
+        </w:numPr>
+        <w:spacing w:after="20"/>
+        <w:rPr>
+          <w:sz w:val="2"/>
+          <w:szCs w:val="2"/>
+        </w:rPr>
+      </w:pPr>
+    </w:p>
+    <w:p>
+      <w:pPr>
+        <w:pBdr>
+          <w:bottom w:val="single" w:sz="4" w:space="1" w:color="CCCCCC"/>
+        </w:pBdr>
+        <w:spacing w:before="120" w:after="60"/>
+        <w:rPr>
+          <w:b/>
+          <w:color w:val="0D0D0D"/>
+          <w:sz w:val="22"/>
+          <w:szCs w:val="24"/>
+        </w:rPr>
+      </w:pPr>
+      <w:r>
+        <w:rPr>
+          <w:b/>
+          <w:color w:val="0D0D0D"/>
+          <w:sz w:val="22"/>
+          <w:szCs w:val="24"/>
+        </w:rPr>
+        <w:t>PROJECTS</w:t>
+      </w:r>
     </w:p>
     <w:p>
       <w:pPr>
@@ -867,12 +1150,503 @@
         </w:tabs>
         <w:spacing w:before="60"/>
         <w:rPr>
+          <w:rFonts w:ascii="Segoe UI Emoji" w:hAnsi="Segoe UI Emoji" w:cs="Segoe UI Emoji"/>
+          <w:lang w:val="en-IN"/>
+        </w:rPr>
+      </w:pPr>
+      <w:hyperlink r:id="rId11" w:history="1">
+        <w:proofErr w:type="spellStart"/>
+        <w:r>
+          <w:rPr>
+            <w:rStyle w:val="Hyperlink"/>
+            <w:rFonts w:asciiTheme="majorHAnsi" w:hAnsiTheme="majorHAnsi" w:cstheme="majorHAnsi"/>
+            <w:b/>
+            <w:bCs/>
+            <w:color w:val="auto"/>
+            <w:sz w:val="22"/>
+            <w:u w:val="none"/>
+            <w:lang w:val="en-IN"/>
+          </w:rPr>
+          <w:t>OpenMind</w:t>
+        </w:r>
+        <w:proofErr w:type="spellEnd"/>
+        <w:r>
+          <w:rPr>
+            <w:rStyle w:val="Hyperlink"/>
+            <w:rFonts w:asciiTheme="majorHAnsi" w:hAnsiTheme="majorHAnsi" w:cstheme="majorHAnsi"/>
+            <w:b/>
+            <w:bCs/>
+            <w:color w:val="auto"/>
+            <w:sz w:val="22"/>
+            <w:u w:val="none"/>
+            <w:lang w:val="en-IN"/>
+          </w:rPr>
+          <w:t xml:space="preserve"> AI Platform — LLM Evaluation &amp; Orchestration Platform</w:t>
+        </w:r>
+      </w:hyperlink>
+      <w:r>
+        <w:rPr>
+          <w:rFonts w:asciiTheme="majorHAnsi" w:hAnsiTheme="majorHAnsi" w:cstheme="majorHAnsi"/>
           <w:b/>
-          <w:color w:val="0D0D0D"/>
+          <w:bCs/>
           <w:sz w:val="22"/>
-          <w:szCs w:val="24"/>
-        </w:rPr>
-      </w:pPr>
+          <w:lang w:val="en-IN"/>
+        </w:rPr>
+        <w:t xml:space="preserve"> </w:t>
+      </w:r>
+      <w:proofErr w:type="gramStart"/>
+      <w:r>
+        <w:rPr>
+          <w:rFonts w:ascii="Segoe UI Emoji" w:hAnsi="Segoe UI Emoji" w:cs="Segoe UI Emoji"/>
+        </w:rPr>
+        <w:t>🔗</w:t>
+      </w:r>
+      <w:r>
+        <w:rPr>
+          <w:b/>
+          <w:color w:val="0E6B0E"/>
+          <w:sz w:val="16"/>
+          <w:szCs w:val="24"/>
+        </w:rPr>
+        <w:t xml:space="preserve">  ONGOING</w:t>
+      </w:r>
+      <w:proofErr w:type="gramEnd"/>
+      <w:r>
+        <w:rPr>
+          <w:sz w:val="20"/>
+          <w:szCs w:val="24"/>
+        </w:rPr>
+        <w:tab/>
+      </w:r>
+      <w:r>
+        <w:rPr>
+          <w:color w:val="555555"/>
+          <w:sz w:val="20"/>
+          <w:szCs w:val="24"/>
+        </w:rPr>
+        <w:t>Jul 2026 – Present</w:t>
+      </w:r>
+    </w:p>
+    <w:p>
+      <w:pPr>
+        <w:spacing w:after="40"/>
+        <w:rPr>
+          <w:sz w:val="20"/>
+          <w:szCs w:val="24"/>
+        </w:rPr>
+      </w:pPr>
+      <w:r>
+        <w:rPr>
+          <w:b/>
+          <w:color w:val="1A5276"/>
+          <w:sz w:val="18"/>
+          <w:szCs w:val="24"/>
+        </w:rPr>
+        <w:t xml:space="preserve">Python | </w:t>
+      </w:r>
+      <w:proofErr w:type="spellStart"/>
+      <w:proofErr w:type="gramStart"/>
+      <w:r>
+        <w:rPr>
+          <w:b/>
+          <w:color w:val="1A5276"/>
+          <w:sz w:val="18"/>
+          <w:szCs w:val="24"/>
+        </w:rPr>
+        <w:t>FastAPI</w:t>
+      </w:r>
+      <w:proofErr w:type="spellEnd"/>
+      <w:r>
+        <w:rPr>
+          <w:b/>
+          <w:color w:val="1A5276"/>
+          <w:sz w:val="18"/>
+          <w:szCs w:val="24"/>
+        </w:rPr>
+        <w:t xml:space="preserve">  |</w:t>
+      </w:r>
+      <w:proofErr w:type="gramEnd"/>
+      <w:r>
+        <w:rPr>
+          <w:b/>
+          <w:color w:val="1A5276"/>
+          <w:sz w:val="18"/>
+          <w:szCs w:val="24"/>
+        </w:rPr>
+        <w:t xml:space="preserve"> LLM APIs | RAG | </w:t>
+      </w:r>
+      <w:proofErr w:type="spellStart"/>
+      <w:r>
+        <w:rPr>
+          <w:b/>
+          <w:color w:val="1A5276"/>
+          <w:sz w:val="18"/>
+          <w:szCs w:val="24"/>
+        </w:rPr>
+        <w:t>pgvector</w:t>
+      </w:r>
+      <w:proofErr w:type="spellEnd"/>
+      <w:r>
+        <w:rPr>
+          <w:b/>
+          <w:color w:val="1A5276"/>
+          <w:sz w:val="18"/>
+          <w:szCs w:val="24"/>
+        </w:rPr>
+        <w:t xml:space="preserve"> | </w:t>
+      </w:r>
+      <w:proofErr w:type="spellStart"/>
+      <w:r>
+        <w:rPr>
+          <w:b/>
+          <w:color w:val="1A5276"/>
+          <w:sz w:val="18"/>
+          <w:szCs w:val="24"/>
+        </w:rPr>
+        <w:t>SQLAlchemy</w:t>
+      </w:r>
+      <w:proofErr w:type="spellEnd"/>
+      <w:r>
+        <w:rPr>
+          <w:b/>
+          <w:color w:val="1A5276"/>
+          <w:sz w:val="18"/>
+          <w:szCs w:val="24"/>
+        </w:rPr>
+        <w:t xml:space="preserve"> | Docker | PostgreSQL</w:t>
+      </w:r>
+    </w:p>
+    <w:p>
+      <w:pPr>
+        <w:pStyle w:val="ListBullet"/>
+        <w:numPr>
+          <w:ilvl w:val="0"/>
+          <w:numId w:val="13"/>
+        </w:numPr>
+        <w:tabs>
+          <w:tab w:val="clear" w:pos="720"/>
+          <w:tab w:val="num" w:pos="284"/>
+        </w:tabs>
+        <w:spacing w:after="20"/>
+        <w:ind w:left="142" w:hanging="142"/>
+        <w:rPr>
+          <w:color w:val="2A2A2A"/>
+          <w:sz w:val="20"/>
+          <w:szCs w:val="24"/>
+          <w:lang w:val="en-IN"/>
+        </w:rPr>
+      </w:pPr>
+      <w:r>
+        <w:rPr>
+          <w:color w:val="2A2A2A"/>
+          <w:sz w:val="20"/>
+          <w:szCs w:val="24"/>
+          <w:lang w:val="en-IN"/>
+        </w:rPr>
+        <w:t>Building a comprehensive AI model evaluation platform to test, compare, and benchmark LLMs across multiple providers (</w:t>
+      </w:r>
+      <w:proofErr w:type="spellStart"/>
+      <w:proofErr w:type="gramStart"/>
+      <w:r>
+        <w:rPr>
+          <w:color w:val="2A2A2A"/>
+          <w:sz w:val="20"/>
+          <w:szCs w:val="24"/>
+          <w:lang w:val="en-IN"/>
+        </w:rPr>
+        <w:t>Nvid</w:t>
+      </w:r>
+      <w:r>
+        <w:rPr>
+          <w:color w:val="2A2A2A"/>
+          <w:sz w:val="20"/>
+          <w:szCs w:val="24"/>
+          <w:lang w:val="en-IN"/>
+        </w:rPr>
+        <w:t>ia,Huggingface</w:t>
+      </w:r>
+      <w:proofErr w:type="spellEnd"/>
+      <w:proofErr w:type="gramEnd"/>
+      <w:r>
+        <w:rPr>
+          <w:color w:val="2A2A2A"/>
+          <w:sz w:val="20"/>
+          <w:szCs w:val="24"/>
+          <w:lang w:val="en-IN"/>
+        </w:rPr>
+        <w:t xml:space="preserve">) with planned support for </w:t>
+      </w:r>
+      <w:proofErr w:type="gramStart"/>
+      <w:r>
+        <w:rPr>
+          <w:color w:val="2A2A2A"/>
+          <w:sz w:val="20"/>
+          <w:szCs w:val="24"/>
+          <w:lang w:val="en-IN"/>
+        </w:rPr>
+        <w:t>locally-hosted</w:t>
+      </w:r>
+      <w:proofErr w:type="gramEnd"/>
+      <w:r>
+        <w:rPr>
+          <w:color w:val="2A2A2A"/>
+          <w:sz w:val="20"/>
+          <w:szCs w:val="24"/>
+          <w:lang w:val="en-IN"/>
+        </w:rPr>
+        <w:t xml:space="preserve"> models (Llama 3, DeepSeek) via </w:t>
+      </w:r>
+      <w:proofErr w:type="spellStart"/>
+      <w:r>
+        <w:rPr>
+          <w:color w:val="2A2A2A"/>
+          <w:sz w:val="20"/>
+          <w:szCs w:val="24"/>
+          <w:lang w:val="en-IN"/>
+        </w:rPr>
+        <w:t>Ollama</w:t>
+      </w:r>
+      <w:proofErr w:type="spellEnd"/>
+      <w:r>
+        <w:rPr>
+          <w:color w:val="2A2A2A"/>
+          <w:sz w:val="20"/>
+          <w:szCs w:val="24"/>
+          <w:lang w:val="en-IN"/>
+        </w:rPr>
+        <w:t>/</w:t>
+      </w:r>
+      <w:proofErr w:type="spellStart"/>
+      <w:r>
+        <w:rPr>
+          <w:color w:val="2A2A2A"/>
+          <w:sz w:val="20"/>
+          <w:szCs w:val="24"/>
+          <w:lang w:val="en-IN"/>
+        </w:rPr>
+        <w:t>vLLM</w:t>
+      </w:r>
+      <w:proofErr w:type="spellEnd"/>
+      <w:r>
+        <w:rPr>
+          <w:color w:val="2A2A2A"/>
+          <w:sz w:val="20"/>
+          <w:szCs w:val="24"/>
+          <w:lang w:val="en-IN"/>
+        </w:rPr>
+        <w:t>.</w:t>
+      </w:r>
+    </w:p>
+    <w:p>
+      <w:pPr>
+        <w:pStyle w:val="ListBullet"/>
+        <w:numPr>
+          <w:ilvl w:val="0"/>
+          <w:numId w:val="13"/>
+        </w:numPr>
+        <w:tabs>
+          <w:tab w:val="clear" w:pos="720"/>
+          <w:tab w:val="num" w:pos="284"/>
+        </w:tabs>
+        <w:spacing w:after="20"/>
+        <w:ind w:left="142" w:hanging="142"/>
+        <w:rPr>
+          <w:color w:val="2A2A2A"/>
+          <w:sz w:val="20"/>
+          <w:szCs w:val="24"/>
+          <w:lang w:val="en-IN"/>
+        </w:rPr>
+      </w:pPr>
+      <w:r>
+        <w:rPr>
+          <w:color w:val="2A2A2A"/>
+          <w:sz w:val="20"/>
+          <w:szCs w:val="24"/>
+          <w:lang w:val="en-IN"/>
+        </w:rPr>
+        <w:lastRenderedPageBreak/>
+        <w:t xml:space="preserve">Engineered a multi-session AI playground with configurable inference parameters (temperature, </w:t>
+      </w:r>
+      <w:proofErr w:type="spellStart"/>
+      <w:r>
+        <w:rPr>
+          <w:color w:val="2A2A2A"/>
+          <w:sz w:val="20"/>
+          <w:szCs w:val="24"/>
+          <w:lang w:val="en-IN"/>
+        </w:rPr>
+        <w:t>top_p</w:t>
+      </w:r>
+      <w:proofErr w:type="spellEnd"/>
+      <w:r>
+        <w:rPr>
+          <w:color w:val="2A2A2A"/>
+          <w:sz w:val="20"/>
+          <w:szCs w:val="24"/>
+          <w:lang w:val="en-IN"/>
+        </w:rPr>
+        <w:t xml:space="preserve">, </w:t>
+      </w:r>
+      <w:proofErr w:type="spellStart"/>
+      <w:r>
+        <w:rPr>
+          <w:color w:val="2A2A2A"/>
+          <w:sz w:val="20"/>
+          <w:szCs w:val="24"/>
+          <w:lang w:val="en-IN"/>
+        </w:rPr>
+        <w:t>max_tokens</w:t>
+      </w:r>
+      <w:proofErr w:type="spellEnd"/>
+      <w:r>
+        <w:rPr>
+          <w:color w:val="2A2A2A"/>
+          <w:sz w:val="20"/>
+          <w:szCs w:val="24"/>
+          <w:lang w:val="en-IN"/>
+        </w:rPr>
+        <w:t>, system prompts) and real-time SSE streaming for interactive response evaluation.</w:t>
+      </w:r>
+    </w:p>
+    <w:p>
+      <w:pPr>
+        <w:pStyle w:val="ListBullet"/>
+        <w:numPr>
+          <w:ilvl w:val="0"/>
+          <w:numId w:val="13"/>
+        </w:numPr>
+        <w:tabs>
+          <w:tab w:val="clear" w:pos="720"/>
+          <w:tab w:val="num" w:pos="284"/>
+        </w:tabs>
+        <w:spacing w:after="20"/>
+        <w:ind w:left="142" w:hanging="142"/>
+        <w:rPr>
+          <w:color w:val="2A2A2A"/>
+          <w:sz w:val="20"/>
+          <w:szCs w:val="24"/>
+          <w:lang w:val="en-IN"/>
+        </w:rPr>
+      </w:pPr>
+      <w:r>
+        <w:rPr>
+          <w:color w:val="2A2A2A"/>
+          <w:sz w:val="20"/>
+          <w:szCs w:val="24"/>
+          <w:lang w:val="en-IN"/>
+        </w:rPr>
+        <w:t xml:space="preserve">Building a RAG pipeline with PDF/Markdown document ingestion, text chunking, embedding model integration, and </w:t>
+      </w:r>
+      <w:proofErr w:type="spellStart"/>
+      <w:r>
+        <w:rPr>
+          <w:color w:val="2A2A2A"/>
+          <w:sz w:val="20"/>
+          <w:szCs w:val="24"/>
+          <w:lang w:val="en-IN"/>
+        </w:rPr>
+        <w:t>pgvector</w:t>
+      </w:r>
+      <w:proofErr w:type="spellEnd"/>
+      <w:r>
+        <w:rPr>
+          <w:color w:val="2A2A2A"/>
+          <w:sz w:val="20"/>
+          <w:szCs w:val="24"/>
+          <w:lang w:val="en-IN"/>
+        </w:rPr>
+        <w:t>-based semantic retrieval — with support for testing different embedding and retrieval model combinations.</w:t>
+      </w:r>
+    </w:p>
+    <w:p>
+      <w:pPr>
+        <w:pStyle w:val="ListBullet"/>
+        <w:numPr>
+          <w:ilvl w:val="0"/>
+          <w:numId w:val="13"/>
+        </w:numPr>
+        <w:tabs>
+          <w:tab w:val="clear" w:pos="720"/>
+          <w:tab w:val="num" w:pos="284"/>
+        </w:tabs>
+        <w:spacing w:after="20"/>
+        <w:ind w:left="142" w:hanging="142"/>
+        <w:rPr>
+          <w:color w:val="2A2A2A"/>
+          <w:sz w:val="20"/>
+          <w:szCs w:val="24"/>
+          <w:lang w:val="en-IN"/>
+        </w:rPr>
+      </w:pPr>
+      <w:r>
+        <w:rPr>
+          <w:color w:val="2A2A2A"/>
+          <w:sz w:val="20"/>
+          <w:szCs w:val="24"/>
+          <w:lang w:val="en-IN"/>
+        </w:rPr>
+        <w:t>Architecting a graph-based multi-tier memory system (Conversation, Semantic, Long-Term) to benchmark how different memory configurations affect AI response quality and coherence.</w:t>
+      </w:r>
+    </w:p>
+    <w:p>
+      <w:pPr>
+        <w:pStyle w:val="ListBullet"/>
+        <w:numPr>
+          <w:ilvl w:val="0"/>
+          <w:numId w:val="13"/>
+        </w:numPr>
+        <w:tabs>
+          <w:tab w:val="clear" w:pos="720"/>
+          <w:tab w:val="num" w:pos="284"/>
+        </w:tabs>
+        <w:spacing w:after="20"/>
+        <w:ind w:left="142" w:hanging="142"/>
+        <w:rPr>
+          <w:color w:val="2A2A2A"/>
+          <w:sz w:val="20"/>
+          <w:szCs w:val="24"/>
+          <w:lang w:val="en-IN"/>
+        </w:rPr>
+      </w:pPr>
+      <w:r>
+        <w:rPr>
+          <w:color w:val="2A2A2A"/>
+          <w:sz w:val="20"/>
+          <w:szCs w:val="24"/>
+          <w:lang w:val="en-IN"/>
+        </w:rPr>
+        <w:t>Designing a multi-step AI workflow orchestration engine for automated LLM routing, conditional branching, and agentic workflows.</w:t>
+      </w:r>
+    </w:p>
+    <w:p>
+      <w:pPr>
+        <w:pStyle w:val="ListBullet"/>
+        <w:numPr>
+          <w:ilvl w:val="0"/>
+          <w:numId w:val="13"/>
+        </w:numPr>
+        <w:tabs>
+          <w:tab w:val="clear" w:pos="720"/>
+          <w:tab w:val="num" w:pos="284"/>
+        </w:tabs>
+        <w:spacing w:after="20"/>
+        <w:ind w:left="142" w:hanging="142"/>
+        <w:rPr>
+          <w:color w:val="2A2A2A"/>
+          <w:sz w:val="20"/>
+          <w:szCs w:val="24"/>
+          <w:lang w:val="en-IN"/>
+        </w:rPr>
+      </w:pPr>
+      <w:r>
+        <w:rPr>
+          <w:color w:val="2A2A2A"/>
+          <w:sz w:val="20"/>
+          <w:szCs w:val="24"/>
+          <w:lang w:val="en-IN"/>
+        </w:rPr>
+        <w:t>Engineered an OpenAI-compatible API gateway with Bearer token authentication, routing inference across 40+ standardized API endpoints with structured logging and monitoring.</w:t>
+      </w:r>
     </w:p>
     <w:p>
       <w:pPr>
@@ -895,7 +1669,7 @@
             <w:szCs w:val="24"/>
             <w:u w:val="none"/>
           </w:rPr>
-          <w:t>Hybrid CNN–YOLO Framework for Car Damage Severity Classification and Localization</w:t>
+          <w:t>Hybrid CNN–YOLO Framework for Car Damage Assessment</w:t>
         </w:r>
       </w:hyperlink>
       <w:r>
@@ -944,65 +1718,246 @@
           <w:sz w:val="18"/>
           <w:szCs w:val="24"/>
         </w:rPr>
-        <w:lastRenderedPageBreak/>
-        <w:t>Python | TensorFlow/Keras | YOLO | OpenCV | FastAPI | Computer Vision</w:t>
+        <w:t>Python | TensorFlow/</w:t>
+      </w:r>
+      <w:proofErr w:type="spellStart"/>
+      <w:r>
+        <w:rPr>
+          <w:b/>
+          <w:color w:val="1A5276"/>
+          <w:sz w:val="18"/>
+          <w:szCs w:val="24"/>
+        </w:rPr>
+        <w:t>Keras</w:t>
+      </w:r>
+      <w:proofErr w:type="spellEnd"/>
+      <w:r>
+        <w:rPr>
+          <w:b/>
+          <w:color w:val="1A5276"/>
+          <w:sz w:val="18"/>
+          <w:szCs w:val="24"/>
+        </w:rPr>
+        <w:t xml:space="preserve"> | YOLO | OpenCV | </w:t>
+      </w:r>
+      <w:proofErr w:type="spellStart"/>
+      <w:r>
+        <w:rPr>
+          <w:b/>
+          <w:color w:val="1A5276"/>
+          <w:sz w:val="18"/>
+          <w:szCs w:val="24"/>
+        </w:rPr>
+        <w:t>FastAPI</w:t>
+      </w:r>
+      <w:proofErr w:type="spellEnd"/>
+      <w:r>
+        <w:rPr>
+          <w:b/>
+          <w:color w:val="1A5276"/>
+          <w:sz w:val="18"/>
+          <w:szCs w:val="24"/>
+        </w:rPr>
+        <w:t xml:space="preserve"> | Computer Vision</w:t>
+      </w:r>
+      <w:r>
+        <w:rPr>
+          <w:b/>
+          <w:color w:val="1A5276"/>
+          <w:sz w:val="18"/>
+          <w:szCs w:val="24"/>
+        </w:rPr>
+        <w:t xml:space="preserve">                                                                                        </w:t>
+      </w:r>
+      <w:proofErr w:type="gramStart"/>
+      <w:r>
+        <w:rPr>
+          <w:b/>
+          <w:color w:val="1A5276"/>
+          <w:sz w:val="18"/>
+          <w:szCs w:val="24"/>
+        </w:rPr>
+        <w:t xml:space="preserve">  </w:t>
+      </w:r>
+      <w:r>
+        <w:rPr>
+          <w:b/>
+          <w:color w:val="1A5276"/>
+          <w:sz w:val="18"/>
+          <w:szCs w:val="24"/>
+        </w:rPr>
+        <w:t xml:space="preserve"> (</w:t>
+      </w:r>
+      <w:proofErr w:type="gramEnd"/>
+      <w:r>
+        <w:rPr>
+          <w:b/>
+          <w:bCs/>
+          <w:color w:val="auto"/>
+          <w:sz w:val="20"/>
+          <w:szCs w:val="28"/>
+        </w:rPr>
+        <w:t>Published</w:t>
+      </w:r>
+      <w:r>
+        <w:rPr>
+          <w:b/>
+          <w:bCs/>
+          <w:color w:val="auto"/>
+          <w:sz w:val="20"/>
+          <w:szCs w:val="28"/>
+        </w:rPr>
+        <w:t>)</w:t>
+      </w:r>
+      <w:r>
+        <w:rPr>
+          <w:b/>
+          <w:color w:val="auto"/>
+          <w:sz w:val="20"/>
+          <w:szCs w:val="28"/>
+        </w:rPr>
+        <w:t> </w:t>
       </w:r>
     </w:p>
     <w:p>
       <w:pPr>
         <w:pStyle w:val="ListBullet"/>
+        <w:numPr>
+          <w:ilvl w:val="0"/>
+          <w:numId w:val="14"/>
+        </w:numPr>
+        <w:tabs>
+          <w:tab w:val="clear" w:pos="720"/>
+          <w:tab w:val="num" w:pos="284"/>
+        </w:tabs>
         <w:spacing w:after="20"/>
-        <w:ind w:left="283"/>
-        <w:rPr>
-          <w:sz w:val="20"/>
-          <w:szCs w:val="24"/>
-        </w:rPr>
-      </w:pPr>
-      <w:r>
+        <w:ind w:left="142" w:hanging="142"/>
         <w:rPr>
           <w:color w:val="2A2A2A"/>
           <w:sz w:val="20"/>
           <w:szCs w:val="24"/>
-        </w:rPr>
-        <w:t>Developed an end-to-end hybrid deep learning framework integrating YOLO-based object detection with CNN-based severity classification for automated vehicle damage assessment.</w:t>
+          <w:lang w:val="en-IN"/>
+        </w:rPr>
+      </w:pPr>
+      <w:r>
+        <w:rPr>
+          <w:color w:val="2A2A2A"/>
+          <w:sz w:val="20"/>
+          <w:szCs w:val="24"/>
+          <w:lang w:val="en-IN"/>
+        </w:rPr>
+        <w:t>Developed an end-to-end hybrid deep learning framework combining YOLO-based object detection with CNN-based severity classification for automated vehicle damage assessment.</w:t>
       </w:r>
     </w:p>
     <w:p>
       <w:pPr>
         <w:pStyle w:val="ListBullet"/>
+        <w:numPr>
+          <w:ilvl w:val="0"/>
+          <w:numId w:val="14"/>
+        </w:numPr>
+        <w:tabs>
+          <w:tab w:val="clear" w:pos="720"/>
+          <w:tab w:val="num" w:pos="284"/>
+        </w:tabs>
         <w:spacing w:after="20"/>
-        <w:ind w:left="283"/>
-        <w:rPr>
-          <w:sz w:val="20"/>
-          <w:szCs w:val="24"/>
-        </w:rPr>
-      </w:pPr>
-      <w:r>
+        <w:ind w:left="142" w:hanging="142"/>
         <w:rPr>
           <w:color w:val="2A2A2A"/>
           <w:sz w:val="20"/>
           <w:szCs w:val="24"/>
-        </w:rPr>
-        <w:t>Built the complete ML pipeline including dataset preparation, model training, hyperparameter tuning, evaluation metrics, and a FastAPI inference backend for real-time predictions.</w:t>
+          <w:lang w:val="en-IN"/>
+        </w:rPr>
+      </w:pPr>
+      <w:r>
+        <w:rPr>
+          <w:color w:val="2A2A2A"/>
+          <w:sz w:val="20"/>
+          <w:szCs w:val="24"/>
+          <w:lang w:val="en-IN"/>
+        </w:rPr>
+        <w:t>Built the complete ML pipeline: dataset curation, model training, hyperparameter optimization, evaluation metrics (</w:t>
+      </w:r>
+      <w:proofErr w:type="spellStart"/>
+      <w:r>
+        <w:rPr>
+          <w:color w:val="2A2A2A"/>
+          <w:sz w:val="20"/>
+          <w:szCs w:val="24"/>
+          <w:lang w:val="en-IN"/>
+        </w:rPr>
+        <w:t>mAP</w:t>
+      </w:r>
+      <w:proofErr w:type="spellEnd"/>
+      <w:r>
+        <w:rPr>
+          <w:color w:val="2A2A2A"/>
+          <w:sz w:val="20"/>
+          <w:szCs w:val="24"/>
+          <w:lang w:val="en-IN"/>
+        </w:rPr>
+        <w:t xml:space="preserve">, F1, precision-recall), and a </w:t>
+      </w:r>
+      <w:proofErr w:type="spellStart"/>
+      <w:r>
+        <w:rPr>
+          <w:color w:val="2A2A2A"/>
+          <w:sz w:val="20"/>
+          <w:szCs w:val="24"/>
+          <w:lang w:val="en-IN"/>
+        </w:rPr>
+        <w:t>FastAPI</w:t>
+      </w:r>
+      <w:proofErr w:type="spellEnd"/>
+      <w:r>
+        <w:rPr>
+          <w:color w:val="2A2A2A"/>
+          <w:sz w:val="20"/>
+          <w:szCs w:val="24"/>
+          <w:lang w:val="en-IN"/>
+        </w:rPr>
+        <w:t xml:space="preserve"> inference backend for real-time predictions.</w:t>
       </w:r>
     </w:p>
     <w:p>
       <w:pPr>
         <w:pStyle w:val="ListBullet"/>
+        <w:numPr>
+          <w:ilvl w:val="0"/>
+          <w:numId w:val="14"/>
+        </w:numPr>
+        <w:tabs>
+          <w:tab w:val="clear" w:pos="720"/>
+          <w:tab w:val="num" w:pos="284"/>
+        </w:tabs>
         <w:spacing w:after="20"/>
-        <w:ind w:left="283"/>
-        <w:rPr>
-          <w:sz w:val="20"/>
-          <w:szCs w:val="24"/>
-        </w:rPr>
-      </w:pPr>
-      <w:r>
+        <w:ind w:left="142" w:hanging="142"/>
         <w:rPr>
           <w:color w:val="2A2A2A"/>
           <w:sz w:val="20"/>
           <w:szCs w:val="24"/>
-        </w:rPr>
-        <w:t>Presented the research at the 2026 IEEE International Conference on Natural Language Processing and Computer Vision (ICNPCV), Bengaluru, India.</w:t>
+          <w:lang w:val="en-IN"/>
+        </w:rPr>
+      </w:pPr>
+      <w:r>
+        <w:rPr>
+          <w:b/>
+          <w:bCs/>
+          <w:color w:val="2A2A2A"/>
+          <w:sz w:val="20"/>
+          <w:szCs w:val="24"/>
+          <w:lang w:val="en-IN"/>
+        </w:rPr>
+        <w:t>Presented and published</w:t>
+      </w:r>
+      <w:r>
+        <w:rPr>
+          <w:color w:val="2A2A2A"/>
+          <w:sz w:val="20"/>
+          <w:szCs w:val="24"/>
+          <w:lang w:val="en-IN"/>
+        </w:rPr>
+        <w:t> at the 2026 IEEE International Conference on Natural Language Processing and Computer Vision (ICNPCV), Bengaluru, India.</w:t>
       </w:r>
     </w:p>
     <w:p>
@@ -1032,6 +1987,7 @@
         </w:rPr>
       </w:pPr>
       <w:hyperlink r:id="rId13" w:history="1">
+        <w:proofErr w:type="spellStart"/>
         <w:r>
           <w:rPr>
             <w:rStyle w:val="Hyperlink"/>
@@ -1041,7 +1997,19 @@
             <w:szCs w:val="24"/>
             <w:u w:val="none"/>
           </w:rPr>
-          <w:t>Vocalix — AI Voice Assistant</w:t>
+          <w:t>Vocalix</w:t>
+        </w:r>
+        <w:proofErr w:type="spellEnd"/>
+        <w:r>
+          <w:rPr>
+            <w:rStyle w:val="Hyperlink"/>
+            <w:b/>
+            <w:color w:val="auto"/>
+            <w:sz w:val="22"/>
+            <w:szCs w:val="24"/>
+            <w:u w:val="none"/>
+          </w:rPr>
+          <w:t xml:space="preserve"> — AI Voice Assistant</w:t>
         </w:r>
       </w:hyperlink>
       <w:r>
@@ -1084,45 +2052,65 @@
           <w:sz w:val="18"/>
           <w:szCs w:val="24"/>
         </w:rPr>
-        <w:t>Python | Speech Recognition | LLM APIs | Automation Libraries</w:t>
+        <w:t>Python | Speech Recognition | LLM APIs | Automation</w:t>
       </w:r>
     </w:p>
     <w:p>
       <w:pPr>
         <w:pStyle w:val="ListBullet"/>
+        <w:numPr>
+          <w:ilvl w:val="0"/>
+          <w:numId w:val="16"/>
+        </w:numPr>
+        <w:tabs>
+          <w:tab w:val="clear" w:pos="720"/>
+        </w:tabs>
         <w:spacing w:after="20"/>
-        <w:ind w:left="283"/>
-        <w:rPr>
-          <w:sz w:val="20"/>
-          <w:szCs w:val="24"/>
-        </w:rPr>
-      </w:pPr>
-      <w:r>
+        <w:ind w:left="142" w:hanging="142"/>
         <w:rPr>
           <w:color w:val="2A2A2A"/>
           <w:sz w:val="20"/>
           <w:szCs w:val="24"/>
-        </w:rPr>
-        <w:t>Built a voice-controlled AI assistant combining speech recognition with LLM inference for natural language task automation and system-level command execution.</w:t>
+          <w:lang w:val="en-IN"/>
+        </w:rPr>
+      </w:pPr>
+      <w:r>
+        <w:rPr>
+          <w:color w:val="2A2A2A"/>
+          <w:sz w:val="20"/>
+          <w:szCs w:val="24"/>
+          <w:lang w:val="en-IN"/>
+        </w:rPr>
+        <w:t>Built a voice-controlled AI assistant combining real-time speech recognition with LLM inference for natural language task automation and system-level command execution.</w:t>
       </w:r>
     </w:p>
     <w:p>
       <w:pPr>
         <w:pStyle w:val="ListBullet"/>
+        <w:numPr>
+          <w:ilvl w:val="0"/>
+          <w:numId w:val="16"/>
+        </w:numPr>
+        <w:tabs>
+          <w:tab w:val="clear" w:pos="720"/>
+        </w:tabs>
         <w:spacing w:after="20"/>
-        <w:ind w:left="283"/>
-        <w:rPr>
-          <w:sz w:val="20"/>
-          <w:szCs w:val="24"/>
-        </w:rPr>
-      </w:pPr>
-      <w:r>
+        <w:ind w:left="142" w:hanging="142"/>
         <w:rPr>
           <w:color w:val="2A2A2A"/>
           <w:sz w:val="20"/>
           <w:szCs w:val="24"/>
-        </w:rPr>
-        <w:t>Engineered a real-time speech-to-LLM-to-action pipeline with modular command processing and dynamic response generation.</w:t>
+          <w:lang w:val="en-IN"/>
+        </w:rPr>
+      </w:pPr>
+      <w:r>
+        <w:rPr>
+          <w:color w:val="2A2A2A"/>
+          <w:sz w:val="20"/>
+          <w:szCs w:val="24"/>
+          <w:lang w:val="en-IN"/>
+        </w:rPr>
+        <w:t>Engineered a modular speech-to-LLM-to-action pipeline with dynamic response generation and extensible command processing.</w:t>
       </w:r>
     </w:p>
     <w:p>
@@ -1199,20 +2187,31 @@
     <w:p>
       <w:pPr>
         <w:pStyle w:val="ListBullet"/>
+        <w:numPr>
+          <w:ilvl w:val="0"/>
+          <w:numId w:val="18"/>
+        </w:numPr>
+        <w:tabs>
+          <w:tab w:val="clear" w:pos="720"/>
+          <w:tab w:val="num" w:pos="426"/>
+        </w:tabs>
         <w:spacing w:after="20"/>
-        <w:ind w:left="283"/>
-        <w:rPr>
-          <w:sz w:val="20"/>
-          <w:szCs w:val="24"/>
-        </w:rPr>
-      </w:pPr>
-      <w:r>
+        <w:ind w:left="142" w:hanging="142"/>
         <w:rPr>
           <w:color w:val="2A2A2A"/>
           <w:sz w:val="20"/>
           <w:szCs w:val="24"/>
-        </w:rPr>
-        <w:t>Published and presented peer-reviewed research on a hybrid deep learning framework combining YOLO object detection with CNN classification for automated vehicle damage assessment.</w:t>
+          <w:lang w:val="en-IN"/>
+        </w:rPr>
+      </w:pPr>
+      <w:r>
+        <w:rPr>
+          <w:color w:val="2A2A2A"/>
+          <w:sz w:val="20"/>
+          <w:szCs w:val="24"/>
+          <w:lang w:val="en-IN"/>
+        </w:rPr>
+        <w:t>Peer-reviewed research on a hybrid deep learning architecture combining YOLO object detection with CNN classification for automated vehicle damage severity assessment. Presented at the conference.</w:t>
       </w:r>
     </w:p>
     <w:p>
@@ -1263,6 +2262,8 @@
           <w:szCs w:val="24"/>
         </w:rPr>
       </w:pPr>
+      <w:proofErr w:type="spellStart"/>
+      <w:proofErr w:type="gramStart"/>
       <w:r>
         <w:rPr>
           <w:b/>
@@ -1270,7 +2271,18 @@
           <w:sz w:val="22"/>
           <w:szCs w:val="24"/>
         </w:rPr>
-        <w:t>B.Tech in Artificial Intelligence and Data Science</w:t>
+        <w:t>B.Tech</w:t>
+      </w:r>
+      <w:proofErr w:type="spellEnd"/>
+      <w:proofErr w:type="gramEnd"/>
+      <w:r>
+        <w:rPr>
+          <w:b/>
+          <w:color w:val="0D0D0D"/>
+          <w:sz w:val="22"/>
+          <w:szCs w:val="24"/>
+        </w:rPr>
+        <w:t xml:space="preserve"> in Artificial Intelligence and Data Science</w:t>
       </w:r>
       <w:r>
         <w:rPr>
@@ -1309,15 +2321,45 @@
           <w:sz w:val="20"/>
           <w:szCs w:val="24"/>
         </w:rPr>
-        <w:t xml:space="preserve">                                                                                                (</w:t>
-      </w:r>
+        <w:t xml:space="preserve">                                                                                             </w:t>
+      </w:r>
+      <w:proofErr w:type="gramStart"/>
       <w:r>
         <w:rPr>
           <w:color w:val="444444"/>
           <w:sz w:val="20"/>
           <w:szCs w:val="24"/>
         </w:rPr>
-        <w:t>Graduated)</w:t>
+        <w:t xml:space="preserve">   </w:t>
+      </w:r>
+      <w:r>
+        <w:rPr>
+          <w:b/>
+          <w:bCs/>
+          <w:color w:val="444444"/>
+          <w:sz w:val="20"/>
+          <w:szCs w:val="24"/>
+        </w:rPr>
+        <w:t>(</w:t>
+      </w:r>
+      <w:proofErr w:type="gramEnd"/>
+      <w:r>
+        <w:rPr>
+          <w:b/>
+          <w:bCs/>
+          <w:color w:val="444444"/>
+          <w:sz w:val="20"/>
+          <w:szCs w:val="24"/>
+        </w:rPr>
+        <w:t>Graduated</w:t>
+      </w:r>
+      <w:r>
+        <w:rPr>
+          <w:color w:val="444444"/>
+          <w:sz w:val="20"/>
+          <w:szCs w:val="24"/>
+        </w:rPr>
+        <w:t>)</w:t>
       </w:r>
     </w:p>
     <w:p>
@@ -1661,7 +2703,7 @@
   <w:abstractNum w:abstractNumId="8" w15:restartNumberingAfterBreak="0">
     <w:nsid w:val="FFFFFF89"/>
     <w:multiLevelType w:val="singleLevel"/>
-    <w:tmpl w:val="055880B8"/>
+    <w:tmpl w:val="D270B474"/>
     <w:lvl w:ilvl="0">
       <w:start w:val="1"/>
       <w:numFmt w:val="bullet"/>
@@ -1676,6 +2718,1347 @@
       </w:pPr>
       <w:rPr>
         <w:rFonts w:ascii="Symbol" w:hAnsi="Symbol" w:hint="default"/>
+      </w:rPr>
+    </w:lvl>
+  </w:abstractNum>
+  <w:abstractNum w:abstractNumId="9" w15:restartNumberingAfterBreak="0">
+    <w:nsid w:val="03DD5262"/>
+    <w:multiLevelType w:val="multilevel"/>
+    <w:tmpl w:val="6618FF3E"/>
+    <w:lvl w:ilvl="0">
+      <w:start w:val="1"/>
+      <w:numFmt w:val="bullet"/>
+      <w:lvlText w:val=""/>
+      <w:lvlJc w:val="left"/>
+      <w:pPr>
+        <w:tabs>
+          <w:tab w:val="num" w:pos="720"/>
+        </w:tabs>
+        <w:ind w:left="720" w:hanging="360"/>
+      </w:pPr>
+      <w:rPr>
+        <w:rFonts w:ascii="Symbol" w:hAnsi="Symbol" w:hint="default"/>
+        <w:sz w:val="20"/>
+      </w:rPr>
+    </w:lvl>
+    <w:lvl w:ilvl="1" w:tentative="1">
+      <w:start w:val="1"/>
+      <w:numFmt w:val="bullet"/>
+      <w:lvlText w:val=""/>
+      <w:lvlJc w:val="left"/>
+      <w:pPr>
+        <w:tabs>
+          <w:tab w:val="num" w:pos="1440"/>
+        </w:tabs>
+        <w:ind w:left="1440" w:hanging="360"/>
+      </w:pPr>
+      <w:rPr>
+        <w:rFonts w:ascii="Symbol" w:hAnsi="Symbol" w:hint="default"/>
+        <w:sz w:val="20"/>
+      </w:rPr>
+    </w:lvl>
+    <w:lvl w:ilvl="2" w:tentative="1">
+      <w:start w:val="1"/>
+      <w:numFmt w:val="bullet"/>
+      <w:lvlText w:val=""/>
+      <w:lvlJc w:val="left"/>
+      <w:pPr>
+        <w:tabs>
+          <w:tab w:val="num" w:pos="2160"/>
+        </w:tabs>
+        <w:ind w:left="2160" w:hanging="360"/>
+      </w:pPr>
+      <w:rPr>
+        <w:rFonts w:ascii="Symbol" w:hAnsi="Symbol" w:hint="default"/>
+        <w:sz w:val="20"/>
+      </w:rPr>
+    </w:lvl>
+    <w:lvl w:ilvl="3" w:tentative="1">
+      <w:start w:val="1"/>
+      <w:numFmt w:val="bullet"/>
+      <w:lvlText w:val=""/>
+      <w:lvlJc w:val="left"/>
+      <w:pPr>
+        <w:tabs>
+          <w:tab w:val="num" w:pos="2880"/>
+        </w:tabs>
+        <w:ind w:left="2880" w:hanging="360"/>
+      </w:pPr>
+      <w:rPr>
+        <w:rFonts w:ascii="Symbol" w:hAnsi="Symbol" w:hint="default"/>
+        <w:sz w:val="20"/>
+      </w:rPr>
+    </w:lvl>
+    <w:lvl w:ilvl="4" w:tentative="1">
+      <w:start w:val="1"/>
+      <w:numFmt w:val="bullet"/>
+      <w:lvlText w:val=""/>
+      <w:lvlJc w:val="left"/>
+      <w:pPr>
+        <w:tabs>
+          <w:tab w:val="num" w:pos="3600"/>
+        </w:tabs>
+        <w:ind w:left="3600" w:hanging="360"/>
+      </w:pPr>
+      <w:rPr>
+        <w:rFonts w:ascii="Symbol" w:hAnsi="Symbol" w:hint="default"/>
+        <w:sz w:val="20"/>
+      </w:rPr>
+    </w:lvl>
+    <w:lvl w:ilvl="5" w:tentative="1">
+      <w:start w:val="1"/>
+      <w:numFmt w:val="bullet"/>
+      <w:lvlText w:val=""/>
+      <w:lvlJc w:val="left"/>
+      <w:pPr>
+        <w:tabs>
+          <w:tab w:val="num" w:pos="4320"/>
+        </w:tabs>
+        <w:ind w:left="4320" w:hanging="360"/>
+      </w:pPr>
+      <w:rPr>
+        <w:rFonts w:ascii="Symbol" w:hAnsi="Symbol" w:hint="default"/>
+        <w:sz w:val="20"/>
+      </w:rPr>
+    </w:lvl>
+    <w:lvl w:ilvl="6" w:tentative="1">
+      <w:start w:val="1"/>
+      <w:numFmt w:val="bullet"/>
+      <w:lvlText w:val=""/>
+      <w:lvlJc w:val="left"/>
+      <w:pPr>
+        <w:tabs>
+          <w:tab w:val="num" w:pos="5040"/>
+        </w:tabs>
+        <w:ind w:left="5040" w:hanging="360"/>
+      </w:pPr>
+      <w:rPr>
+        <w:rFonts w:ascii="Symbol" w:hAnsi="Symbol" w:hint="default"/>
+        <w:sz w:val="20"/>
+      </w:rPr>
+    </w:lvl>
+    <w:lvl w:ilvl="7" w:tentative="1">
+      <w:start w:val="1"/>
+      <w:numFmt w:val="bullet"/>
+      <w:lvlText w:val=""/>
+      <w:lvlJc w:val="left"/>
+      <w:pPr>
+        <w:tabs>
+          <w:tab w:val="num" w:pos="5760"/>
+        </w:tabs>
+        <w:ind w:left="5760" w:hanging="360"/>
+      </w:pPr>
+      <w:rPr>
+        <w:rFonts w:ascii="Symbol" w:hAnsi="Symbol" w:hint="default"/>
+        <w:sz w:val="20"/>
+      </w:rPr>
+    </w:lvl>
+    <w:lvl w:ilvl="8" w:tentative="1">
+      <w:start w:val="1"/>
+      <w:numFmt w:val="bullet"/>
+      <w:lvlText w:val=""/>
+      <w:lvlJc w:val="left"/>
+      <w:pPr>
+        <w:tabs>
+          <w:tab w:val="num" w:pos="6480"/>
+        </w:tabs>
+        <w:ind w:left="6480" w:hanging="360"/>
+      </w:pPr>
+      <w:rPr>
+        <w:rFonts w:ascii="Symbol" w:hAnsi="Symbol" w:hint="default"/>
+        <w:sz w:val="20"/>
+      </w:rPr>
+    </w:lvl>
+  </w:abstractNum>
+  <w:abstractNum w:abstractNumId="10" w15:restartNumberingAfterBreak="0">
+    <w:nsid w:val="10A9464B"/>
+    <w:multiLevelType w:val="multilevel"/>
+    <w:tmpl w:val="C82CF296"/>
+    <w:lvl w:ilvl="0">
+      <w:start w:val="1"/>
+      <w:numFmt w:val="bullet"/>
+      <w:lvlText w:val=""/>
+      <w:lvlJc w:val="left"/>
+      <w:pPr>
+        <w:tabs>
+          <w:tab w:val="num" w:pos="720"/>
+        </w:tabs>
+        <w:ind w:left="720" w:hanging="360"/>
+      </w:pPr>
+      <w:rPr>
+        <w:rFonts w:ascii="Symbol" w:hAnsi="Symbol" w:hint="default"/>
+        <w:sz w:val="20"/>
+      </w:rPr>
+    </w:lvl>
+    <w:lvl w:ilvl="1" w:tentative="1">
+      <w:start w:val="1"/>
+      <w:numFmt w:val="bullet"/>
+      <w:lvlText w:val=""/>
+      <w:lvlJc w:val="left"/>
+      <w:pPr>
+        <w:tabs>
+          <w:tab w:val="num" w:pos="1440"/>
+        </w:tabs>
+        <w:ind w:left="1440" w:hanging="360"/>
+      </w:pPr>
+      <w:rPr>
+        <w:rFonts w:ascii="Symbol" w:hAnsi="Symbol" w:hint="default"/>
+        <w:sz w:val="20"/>
+      </w:rPr>
+    </w:lvl>
+    <w:lvl w:ilvl="2" w:tentative="1">
+      <w:start w:val="1"/>
+      <w:numFmt w:val="bullet"/>
+      <w:lvlText w:val=""/>
+      <w:lvlJc w:val="left"/>
+      <w:pPr>
+        <w:tabs>
+          <w:tab w:val="num" w:pos="2160"/>
+        </w:tabs>
+        <w:ind w:left="2160" w:hanging="360"/>
+      </w:pPr>
+      <w:rPr>
+        <w:rFonts w:ascii="Symbol" w:hAnsi="Symbol" w:hint="default"/>
+        <w:sz w:val="20"/>
+      </w:rPr>
+    </w:lvl>
+    <w:lvl w:ilvl="3" w:tentative="1">
+      <w:start w:val="1"/>
+      <w:numFmt w:val="bullet"/>
+      <w:lvlText w:val=""/>
+      <w:lvlJc w:val="left"/>
+      <w:pPr>
+        <w:tabs>
+          <w:tab w:val="num" w:pos="2880"/>
+        </w:tabs>
+        <w:ind w:left="2880" w:hanging="360"/>
+      </w:pPr>
+      <w:rPr>
+        <w:rFonts w:ascii="Symbol" w:hAnsi="Symbol" w:hint="default"/>
+        <w:sz w:val="20"/>
+      </w:rPr>
+    </w:lvl>
+    <w:lvl w:ilvl="4" w:tentative="1">
+      <w:start w:val="1"/>
+      <w:numFmt w:val="bullet"/>
+      <w:lvlText w:val=""/>
+      <w:lvlJc w:val="left"/>
+      <w:pPr>
+        <w:tabs>
+          <w:tab w:val="num" w:pos="3600"/>
+        </w:tabs>
+        <w:ind w:left="3600" w:hanging="360"/>
+      </w:pPr>
+      <w:rPr>
+        <w:rFonts w:ascii="Symbol" w:hAnsi="Symbol" w:hint="default"/>
+        <w:sz w:val="20"/>
+      </w:rPr>
+    </w:lvl>
+    <w:lvl w:ilvl="5" w:tentative="1">
+      <w:start w:val="1"/>
+      <w:numFmt w:val="bullet"/>
+      <w:lvlText w:val=""/>
+      <w:lvlJc w:val="left"/>
+      <w:pPr>
+        <w:tabs>
+          <w:tab w:val="num" w:pos="4320"/>
+        </w:tabs>
+        <w:ind w:left="4320" w:hanging="360"/>
+      </w:pPr>
+      <w:rPr>
+        <w:rFonts w:ascii="Symbol" w:hAnsi="Symbol" w:hint="default"/>
+        <w:sz w:val="20"/>
+      </w:rPr>
+    </w:lvl>
+    <w:lvl w:ilvl="6" w:tentative="1">
+      <w:start w:val="1"/>
+      <w:numFmt w:val="bullet"/>
+      <w:lvlText w:val=""/>
+      <w:lvlJc w:val="left"/>
+      <w:pPr>
+        <w:tabs>
+          <w:tab w:val="num" w:pos="5040"/>
+        </w:tabs>
+        <w:ind w:left="5040" w:hanging="360"/>
+      </w:pPr>
+      <w:rPr>
+        <w:rFonts w:ascii="Symbol" w:hAnsi="Symbol" w:hint="default"/>
+        <w:sz w:val="20"/>
+      </w:rPr>
+    </w:lvl>
+    <w:lvl w:ilvl="7" w:tentative="1">
+      <w:start w:val="1"/>
+      <w:numFmt w:val="bullet"/>
+      <w:lvlText w:val=""/>
+      <w:lvlJc w:val="left"/>
+      <w:pPr>
+        <w:tabs>
+          <w:tab w:val="num" w:pos="5760"/>
+        </w:tabs>
+        <w:ind w:left="5760" w:hanging="360"/>
+      </w:pPr>
+      <w:rPr>
+        <w:rFonts w:ascii="Symbol" w:hAnsi="Symbol" w:hint="default"/>
+        <w:sz w:val="20"/>
+      </w:rPr>
+    </w:lvl>
+    <w:lvl w:ilvl="8" w:tentative="1">
+      <w:start w:val="1"/>
+      <w:numFmt w:val="bullet"/>
+      <w:lvlText w:val=""/>
+      <w:lvlJc w:val="left"/>
+      <w:pPr>
+        <w:tabs>
+          <w:tab w:val="num" w:pos="6480"/>
+        </w:tabs>
+        <w:ind w:left="6480" w:hanging="360"/>
+      </w:pPr>
+      <w:rPr>
+        <w:rFonts w:ascii="Symbol" w:hAnsi="Symbol" w:hint="default"/>
+        <w:sz w:val="20"/>
+      </w:rPr>
+    </w:lvl>
+  </w:abstractNum>
+  <w:abstractNum w:abstractNumId="11" w15:restartNumberingAfterBreak="0">
+    <w:nsid w:val="114121D2"/>
+    <w:multiLevelType w:val="multilevel"/>
+    <w:tmpl w:val="396E9D48"/>
+    <w:lvl w:ilvl="0">
+      <w:start w:val="1"/>
+      <w:numFmt w:val="bullet"/>
+      <w:lvlText w:val=""/>
+      <w:lvlJc w:val="left"/>
+      <w:pPr>
+        <w:tabs>
+          <w:tab w:val="num" w:pos="720"/>
+        </w:tabs>
+        <w:ind w:left="720" w:hanging="360"/>
+      </w:pPr>
+      <w:rPr>
+        <w:rFonts w:ascii="Symbol" w:hAnsi="Symbol" w:hint="default"/>
+        <w:sz w:val="20"/>
+      </w:rPr>
+    </w:lvl>
+    <w:lvl w:ilvl="1" w:tentative="1">
+      <w:start w:val="1"/>
+      <w:numFmt w:val="bullet"/>
+      <w:lvlText w:val=""/>
+      <w:lvlJc w:val="left"/>
+      <w:pPr>
+        <w:tabs>
+          <w:tab w:val="num" w:pos="1440"/>
+        </w:tabs>
+        <w:ind w:left="1440" w:hanging="360"/>
+      </w:pPr>
+      <w:rPr>
+        <w:rFonts w:ascii="Symbol" w:hAnsi="Symbol" w:hint="default"/>
+        <w:sz w:val="20"/>
+      </w:rPr>
+    </w:lvl>
+    <w:lvl w:ilvl="2" w:tentative="1">
+      <w:start w:val="1"/>
+      <w:numFmt w:val="bullet"/>
+      <w:lvlText w:val=""/>
+      <w:lvlJc w:val="left"/>
+      <w:pPr>
+        <w:tabs>
+          <w:tab w:val="num" w:pos="2160"/>
+        </w:tabs>
+        <w:ind w:left="2160" w:hanging="360"/>
+      </w:pPr>
+      <w:rPr>
+        <w:rFonts w:ascii="Symbol" w:hAnsi="Symbol" w:hint="default"/>
+        <w:sz w:val="20"/>
+      </w:rPr>
+    </w:lvl>
+    <w:lvl w:ilvl="3" w:tentative="1">
+      <w:start w:val="1"/>
+      <w:numFmt w:val="bullet"/>
+      <w:lvlText w:val=""/>
+      <w:lvlJc w:val="left"/>
+      <w:pPr>
+        <w:tabs>
+          <w:tab w:val="num" w:pos="2880"/>
+        </w:tabs>
+        <w:ind w:left="2880" w:hanging="360"/>
+      </w:pPr>
+      <w:rPr>
+        <w:rFonts w:ascii="Symbol" w:hAnsi="Symbol" w:hint="default"/>
+        <w:sz w:val="20"/>
+      </w:rPr>
+    </w:lvl>
+    <w:lvl w:ilvl="4" w:tentative="1">
+      <w:start w:val="1"/>
+      <w:numFmt w:val="bullet"/>
+      <w:lvlText w:val=""/>
+      <w:lvlJc w:val="left"/>
+      <w:pPr>
+        <w:tabs>
+          <w:tab w:val="num" w:pos="3600"/>
+        </w:tabs>
+        <w:ind w:left="3600" w:hanging="360"/>
+      </w:pPr>
+      <w:rPr>
+        <w:rFonts w:ascii="Symbol" w:hAnsi="Symbol" w:hint="default"/>
+        <w:sz w:val="20"/>
+      </w:rPr>
+    </w:lvl>
+    <w:lvl w:ilvl="5" w:tentative="1">
+      <w:start w:val="1"/>
+      <w:numFmt w:val="bullet"/>
+      <w:lvlText w:val=""/>
+      <w:lvlJc w:val="left"/>
+      <w:pPr>
+        <w:tabs>
+          <w:tab w:val="num" w:pos="4320"/>
+        </w:tabs>
+        <w:ind w:left="4320" w:hanging="360"/>
+      </w:pPr>
+      <w:rPr>
+        <w:rFonts w:ascii="Symbol" w:hAnsi="Symbol" w:hint="default"/>
+        <w:sz w:val="20"/>
+      </w:rPr>
+    </w:lvl>
+    <w:lvl w:ilvl="6" w:tentative="1">
+      <w:start w:val="1"/>
+      <w:numFmt w:val="bullet"/>
+      <w:lvlText w:val=""/>
+      <w:lvlJc w:val="left"/>
+      <w:pPr>
+        <w:tabs>
+          <w:tab w:val="num" w:pos="5040"/>
+        </w:tabs>
+        <w:ind w:left="5040" w:hanging="360"/>
+      </w:pPr>
+      <w:rPr>
+        <w:rFonts w:ascii="Symbol" w:hAnsi="Symbol" w:hint="default"/>
+        <w:sz w:val="20"/>
+      </w:rPr>
+    </w:lvl>
+    <w:lvl w:ilvl="7" w:tentative="1">
+      <w:start w:val="1"/>
+      <w:numFmt w:val="bullet"/>
+      <w:lvlText w:val=""/>
+      <w:lvlJc w:val="left"/>
+      <w:pPr>
+        <w:tabs>
+          <w:tab w:val="num" w:pos="5760"/>
+        </w:tabs>
+        <w:ind w:left="5760" w:hanging="360"/>
+      </w:pPr>
+      <w:rPr>
+        <w:rFonts w:ascii="Symbol" w:hAnsi="Symbol" w:hint="default"/>
+        <w:sz w:val="20"/>
+      </w:rPr>
+    </w:lvl>
+    <w:lvl w:ilvl="8" w:tentative="1">
+      <w:start w:val="1"/>
+      <w:numFmt w:val="bullet"/>
+      <w:lvlText w:val=""/>
+      <w:lvlJc w:val="left"/>
+      <w:pPr>
+        <w:tabs>
+          <w:tab w:val="num" w:pos="6480"/>
+        </w:tabs>
+        <w:ind w:left="6480" w:hanging="360"/>
+      </w:pPr>
+      <w:rPr>
+        <w:rFonts w:ascii="Symbol" w:hAnsi="Symbol" w:hint="default"/>
+        <w:sz w:val="20"/>
+      </w:rPr>
+    </w:lvl>
+  </w:abstractNum>
+  <w:abstractNum w:abstractNumId="12" w15:restartNumberingAfterBreak="0">
+    <w:nsid w:val="257C40FF"/>
+    <w:multiLevelType w:val="multilevel"/>
+    <w:tmpl w:val="396E9D48"/>
+    <w:lvl w:ilvl="0">
+      <w:start w:val="1"/>
+      <w:numFmt w:val="bullet"/>
+      <w:lvlText w:val=""/>
+      <w:lvlJc w:val="left"/>
+      <w:pPr>
+        <w:tabs>
+          <w:tab w:val="num" w:pos="720"/>
+        </w:tabs>
+        <w:ind w:left="720" w:hanging="360"/>
+      </w:pPr>
+      <w:rPr>
+        <w:rFonts w:ascii="Symbol" w:hAnsi="Symbol" w:hint="default"/>
+        <w:sz w:val="20"/>
+      </w:rPr>
+    </w:lvl>
+    <w:lvl w:ilvl="1" w:tentative="1">
+      <w:start w:val="1"/>
+      <w:numFmt w:val="bullet"/>
+      <w:lvlText w:val=""/>
+      <w:lvlJc w:val="left"/>
+      <w:pPr>
+        <w:tabs>
+          <w:tab w:val="num" w:pos="1440"/>
+        </w:tabs>
+        <w:ind w:left="1440" w:hanging="360"/>
+      </w:pPr>
+      <w:rPr>
+        <w:rFonts w:ascii="Symbol" w:hAnsi="Symbol" w:hint="default"/>
+        <w:sz w:val="20"/>
+      </w:rPr>
+    </w:lvl>
+    <w:lvl w:ilvl="2" w:tentative="1">
+      <w:start w:val="1"/>
+      <w:numFmt w:val="bullet"/>
+      <w:lvlText w:val=""/>
+      <w:lvlJc w:val="left"/>
+      <w:pPr>
+        <w:tabs>
+          <w:tab w:val="num" w:pos="2160"/>
+        </w:tabs>
+        <w:ind w:left="2160" w:hanging="360"/>
+      </w:pPr>
+      <w:rPr>
+        <w:rFonts w:ascii="Symbol" w:hAnsi="Symbol" w:hint="default"/>
+        <w:sz w:val="20"/>
+      </w:rPr>
+    </w:lvl>
+    <w:lvl w:ilvl="3" w:tentative="1">
+      <w:start w:val="1"/>
+      <w:numFmt w:val="bullet"/>
+      <w:lvlText w:val=""/>
+      <w:lvlJc w:val="left"/>
+      <w:pPr>
+        <w:tabs>
+          <w:tab w:val="num" w:pos="2880"/>
+        </w:tabs>
+        <w:ind w:left="2880" w:hanging="360"/>
+      </w:pPr>
+      <w:rPr>
+        <w:rFonts w:ascii="Symbol" w:hAnsi="Symbol" w:hint="default"/>
+        <w:sz w:val="20"/>
+      </w:rPr>
+    </w:lvl>
+    <w:lvl w:ilvl="4" w:tentative="1">
+      <w:start w:val="1"/>
+      <w:numFmt w:val="bullet"/>
+      <w:lvlText w:val=""/>
+      <w:lvlJc w:val="left"/>
+      <w:pPr>
+        <w:tabs>
+          <w:tab w:val="num" w:pos="3600"/>
+        </w:tabs>
+        <w:ind w:left="3600" w:hanging="360"/>
+      </w:pPr>
+      <w:rPr>
+        <w:rFonts w:ascii="Symbol" w:hAnsi="Symbol" w:hint="default"/>
+        <w:sz w:val="20"/>
+      </w:rPr>
+    </w:lvl>
+    <w:lvl w:ilvl="5" w:tentative="1">
+      <w:start w:val="1"/>
+      <w:numFmt w:val="bullet"/>
+      <w:lvlText w:val=""/>
+      <w:lvlJc w:val="left"/>
+      <w:pPr>
+        <w:tabs>
+          <w:tab w:val="num" w:pos="4320"/>
+        </w:tabs>
+        <w:ind w:left="4320" w:hanging="360"/>
+      </w:pPr>
+      <w:rPr>
+        <w:rFonts w:ascii="Symbol" w:hAnsi="Symbol" w:hint="default"/>
+        <w:sz w:val="20"/>
+      </w:rPr>
+    </w:lvl>
+    <w:lvl w:ilvl="6" w:tentative="1">
+      <w:start w:val="1"/>
+      <w:numFmt w:val="bullet"/>
+      <w:lvlText w:val=""/>
+      <w:lvlJc w:val="left"/>
+      <w:pPr>
+        <w:tabs>
+          <w:tab w:val="num" w:pos="5040"/>
+        </w:tabs>
+        <w:ind w:left="5040" w:hanging="360"/>
+      </w:pPr>
+      <w:rPr>
+        <w:rFonts w:ascii="Symbol" w:hAnsi="Symbol" w:hint="default"/>
+        <w:sz w:val="20"/>
+      </w:rPr>
+    </w:lvl>
+    <w:lvl w:ilvl="7" w:tentative="1">
+      <w:start w:val="1"/>
+      <w:numFmt w:val="bullet"/>
+      <w:lvlText w:val=""/>
+      <w:lvlJc w:val="left"/>
+      <w:pPr>
+        <w:tabs>
+          <w:tab w:val="num" w:pos="5760"/>
+        </w:tabs>
+        <w:ind w:left="5760" w:hanging="360"/>
+      </w:pPr>
+      <w:rPr>
+        <w:rFonts w:ascii="Symbol" w:hAnsi="Symbol" w:hint="default"/>
+        <w:sz w:val="20"/>
+      </w:rPr>
+    </w:lvl>
+    <w:lvl w:ilvl="8" w:tentative="1">
+      <w:start w:val="1"/>
+      <w:numFmt w:val="bullet"/>
+      <w:lvlText w:val=""/>
+      <w:lvlJc w:val="left"/>
+      <w:pPr>
+        <w:tabs>
+          <w:tab w:val="num" w:pos="6480"/>
+        </w:tabs>
+        <w:ind w:left="6480" w:hanging="360"/>
+      </w:pPr>
+      <w:rPr>
+        <w:rFonts w:ascii="Symbol" w:hAnsi="Symbol" w:hint="default"/>
+        <w:sz w:val="20"/>
+      </w:rPr>
+    </w:lvl>
+  </w:abstractNum>
+  <w:abstractNum w:abstractNumId="13" w15:restartNumberingAfterBreak="0">
+    <w:nsid w:val="3B282947"/>
+    <w:multiLevelType w:val="multilevel"/>
+    <w:tmpl w:val="396E9D48"/>
+    <w:lvl w:ilvl="0">
+      <w:start w:val="1"/>
+      <w:numFmt w:val="bullet"/>
+      <w:lvlText w:val=""/>
+      <w:lvlJc w:val="left"/>
+      <w:pPr>
+        <w:tabs>
+          <w:tab w:val="num" w:pos="720"/>
+        </w:tabs>
+        <w:ind w:left="720" w:hanging="360"/>
+      </w:pPr>
+      <w:rPr>
+        <w:rFonts w:ascii="Symbol" w:hAnsi="Symbol" w:hint="default"/>
+        <w:sz w:val="20"/>
+      </w:rPr>
+    </w:lvl>
+    <w:lvl w:ilvl="1" w:tentative="1">
+      <w:start w:val="1"/>
+      <w:numFmt w:val="bullet"/>
+      <w:lvlText w:val=""/>
+      <w:lvlJc w:val="left"/>
+      <w:pPr>
+        <w:tabs>
+          <w:tab w:val="num" w:pos="1440"/>
+        </w:tabs>
+        <w:ind w:left="1440" w:hanging="360"/>
+      </w:pPr>
+      <w:rPr>
+        <w:rFonts w:ascii="Symbol" w:hAnsi="Symbol" w:hint="default"/>
+        <w:sz w:val="20"/>
+      </w:rPr>
+    </w:lvl>
+    <w:lvl w:ilvl="2" w:tentative="1">
+      <w:start w:val="1"/>
+      <w:numFmt w:val="bullet"/>
+      <w:lvlText w:val=""/>
+      <w:lvlJc w:val="left"/>
+      <w:pPr>
+        <w:tabs>
+          <w:tab w:val="num" w:pos="2160"/>
+        </w:tabs>
+        <w:ind w:left="2160" w:hanging="360"/>
+      </w:pPr>
+      <w:rPr>
+        <w:rFonts w:ascii="Symbol" w:hAnsi="Symbol" w:hint="default"/>
+        <w:sz w:val="20"/>
+      </w:rPr>
+    </w:lvl>
+    <w:lvl w:ilvl="3" w:tentative="1">
+      <w:start w:val="1"/>
+      <w:numFmt w:val="bullet"/>
+      <w:lvlText w:val=""/>
+      <w:lvlJc w:val="left"/>
+      <w:pPr>
+        <w:tabs>
+          <w:tab w:val="num" w:pos="2880"/>
+        </w:tabs>
+        <w:ind w:left="2880" w:hanging="360"/>
+      </w:pPr>
+      <w:rPr>
+        <w:rFonts w:ascii="Symbol" w:hAnsi="Symbol" w:hint="default"/>
+        <w:sz w:val="20"/>
+      </w:rPr>
+    </w:lvl>
+    <w:lvl w:ilvl="4" w:tentative="1">
+      <w:start w:val="1"/>
+      <w:numFmt w:val="bullet"/>
+      <w:lvlText w:val=""/>
+      <w:lvlJc w:val="left"/>
+      <w:pPr>
+        <w:tabs>
+          <w:tab w:val="num" w:pos="3600"/>
+        </w:tabs>
+        <w:ind w:left="3600" w:hanging="360"/>
+      </w:pPr>
+      <w:rPr>
+        <w:rFonts w:ascii="Symbol" w:hAnsi="Symbol" w:hint="default"/>
+        <w:sz w:val="20"/>
+      </w:rPr>
+    </w:lvl>
+    <w:lvl w:ilvl="5" w:tentative="1">
+      <w:start w:val="1"/>
+      <w:numFmt w:val="bullet"/>
+      <w:lvlText w:val=""/>
+      <w:lvlJc w:val="left"/>
+      <w:pPr>
+        <w:tabs>
+          <w:tab w:val="num" w:pos="4320"/>
+        </w:tabs>
+        <w:ind w:left="4320" w:hanging="360"/>
+      </w:pPr>
+      <w:rPr>
+        <w:rFonts w:ascii="Symbol" w:hAnsi="Symbol" w:hint="default"/>
+        <w:sz w:val="20"/>
+      </w:rPr>
+    </w:lvl>
+    <w:lvl w:ilvl="6" w:tentative="1">
+      <w:start w:val="1"/>
+      <w:numFmt w:val="bullet"/>
+      <w:lvlText w:val=""/>
+      <w:lvlJc w:val="left"/>
+      <w:pPr>
+        <w:tabs>
+          <w:tab w:val="num" w:pos="5040"/>
+        </w:tabs>
+        <w:ind w:left="5040" w:hanging="360"/>
+      </w:pPr>
+      <w:rPr>
+        <w:rFonts w:ascii="Symbol" w:hAnsi="Symbol" w:hint="default"/>
+        <w:sz w:val="20"/>
+      </w:rPr>
+    </w:lvl>
+    <w:lvl w:ilvl="7" w:tentative="1">
+      <w:start w:val="1"/>
+      <w:numFmt w:val="bullet"/>
+      <w:lvlText w:val=""/>
+      <w:lvlJc w:val="left"/>
+      <w:pPr>
+        <w:tabs>
+          <w:tab w:val="num" w:pos="5760"/>
+        </w:tabs>
+        <w:ind w:left="5760" w:hanging="360"/>
+      </w:pPr>
+      <w:rPr>
+        <w:rFonts w:ascii="Symbol" w:hAnsi="Symbol" w:hint="default"/>
+        <w:sz w:val="20"/>
+      </w:rPr>
+    </w:lvl>
+    <w:lvl w:ilvl="8" w:tentative="1">
+      <w:start w:val="1"/>
+      <w:numFmt w:val="bullet"/>
+      <w:lvlText w:val=""/>
+      <w:lvlJc w:val="left"/>
+      <w:pPr>
+        <w:tabs>
+          <w:tab w:val="num" w:pos="6480"/>
+        </w:tabs>
+        <w:ind w:left="6480" w:hanging="360"/>
+      </w:pPr>
+      <w:rPr>
+        <w:rFonts w:ascii="Symbol" w:hAnsi="Symbol" w:hint="default"/>
+        <w:sz w:val="20"/>
+      </w:rPr>
+    </w:lvl>
+  </w:abstractNum>
+  <w:abstractNum w:abstractNumId="14" w15:restartNumberingAfterBreak="0">
+    <w:nsid w:val="567B6A73"/>
+    <w:multiLevelType w:val="multilevel"/>
+    <w:tmpl w:val="F2D2266E"/>
+    <w:lvl w:ilvl="0">
+      <w:start w:val="1"/>
+      <w:numFmt w:val="bullet"/>
+      <w:lvlText w:val=""/>
+      <w:lvlJc w:val="left"/>
+      <w:pPr>
+        <w:tabs>
+          <w:tab w:val="num" w:pos="720"/>
+        </w:tabs>
+        <w:ind w:left="720" w:hanging="360"/>
+      </w:pPr>
+      <w:rPr>
+        <w:rFonts w:ascii="Symbol" w:hAnsi="Symbol" w:hint="default"/>
+        <w:sz w:val="20"/>
+      </w:rPr>
+    </w:lvl>
+    <w:lvl w:ilvl="1" w:tentative="1">
+      <w:start w:val="1"/>
+      <w:numFmt w:val="bullet"/>
+      <w:lvlText w:val=""/>
+      <w:lvlJc w:val="left"/>
+      <w:pPr>
+        <w:tabs>
+          <w:tab w:val="num" w:pos="1440"/>
+        </w:tabs>
+        <w:ind w:left="1440" w:hanging="360"/>
+      </w:pPr>
+      <w:rPr>
+        <w:rFonts w:ascii="Symbol" w:hAnsi="Symbol" w:hint="default"/>
+        <w:sz w:val="20"/>
+      </w:rPr>
+    </w:lvl>
+    <w:lvl w:ilvl="2" w:tentative="1">
+      <w:start w:val="1"/>
+      <w:numFmt w:val="bullet"/>
+      <w:lvlText w:val=""/>
+      <w:lvlJc w:val="left"/>
+      <w:pPr>
+        <w:tabs>
+          <w:tab w:val="num" w:pos="2160"/>
+        </w:tabs>
+        <w:ind w:left="2160" w:hanging="360"/>
+      </w:pPr>
+      <w:rPr>
+        <w:rFonts w:ascii="Symbol" w:hAnsi="Symbol" w:hint="default"/>
+        <w:sz w:val="20"/>
+      </w:rPr>
+    </w:lvl>
+    <w:lvl w:ilvl="3" w:tentative="1">
+      <w:start w:val="1"/>
+      <w:numFmt w:val="bullet"/>
+      <w:lvlText w:val=""/>
+      <w:lvlJc w:val="left"/>
+      <w:pPr>
+        <w:tabs>
+          <w:tab w:val="num" w:pos="2880"/>
+        </w:tabs>
+        <w:ind w:left="2880" w:hanging="360"/>
+      </w:pPr>
+      <w:rPr>
+        <w:rFonts w:ascii="Symbol" w:hAnsi="Symbol" w:hint="default"/>
+        <w:sz w:val="20"/>
+      </w:rPr>
+    </w:lvl>
+    <w:lvl w:ilvl="4" w:tentative="1">
+      <w:start w:val="1"/>
+      <w:numFmt w:val="bullet"/>
+      <w:lvlText w:val=""/>
+      <w:lvlJc w:val="left"/>
+      <w:pPr>
+        <w:tabs>
+          <w:tab w:val="num" w:pos="3600"/>
+        </w:tabs>
+        <w:ind w:left="3600" w:hanging="360"/>
+      </w:pPr>
+      <w:rPr>
+        <w:rFonts w:ascii="Symbol" w:hAnsi="Symbol" w:hint="default"/>
+        <w:sz w:val="20"/>
+      </w:rPr>
+    </w:lvl>
+    <w:lvl w:ilvl="5" w:tentative="1">
+      <w:start w:val="1"/>
+      <w:numFmt w:val="bullet"/>
+      <w:lvlText w:val=""/>
+      <w:lvlJc w:val="left"/>
+      <w:pPr>
+        <w:tabs>
+          <w:tab w:val="num" w:pos="4320"/>
+        </w:tabs>
+        <w:ind w:left="4320" w:hanging="360"/>
+      </w:pPr>
+      <w:rPr>
+        <w:rFonts w:ascii="Symbol" w:hAnsi="Symbol" w:hint="default"/>
+        <w:sz w:val="20"/>
+      </w:rPr>
+    </w:lvl>
+    <w:lvl w:ilvl="6" w:tentative="1">
+      <w:start w:val="1"/>
+      <w:numFmt w:val="bullet"/>
+      <w:lvlText w:val=""/>
+      <w:lvlJc w:val="left"/>
+      <w:pPr>
+        <w:tabs>
+          <w:tab w:val="num" w:pos="5040"/>
+        </w:tabs>
+        <w:ind w:left="5040" w:hanging="360"/>
+      </w:pPr>
+      <w:rPr>
+        <w:rFonts w:ascii="Symbol" w:hAnsi="Symbol" w:hint="default"/>
+        <w:sz w:val="20"/>
+      </w:rPr>
+    </w:lvl>
+    <w:lvl w:ilvl="7" w:tentative="1">
+      <w:start w:val="1"/>
+      <w:numFmt w:val="bullet"/>
+      <w:lvlText w:val=""/>
+      <w:lvlJc w:val="left"/>
+      <w:pPr>
+        <w:tabs>
+          <w:tab w:val="num" w:pos="5760"/>
+        </w:tabs>
+        <w:ind w:left="5760" w:hanging="360"/>
+      </w:pPr>
+      <w:rPr>
+        <w:rFonts w:ascii="Symbol" w:hAnsi="Symbol" w:hint="default"/>
+        <w:sz w:val="20"/>
+      </w:rPr>
+    </w:lvl>
+    <w:lvl w:ilvl="8" w:tentative="1">
+      <w:start w:val="1"/>
+      <w:numFmt w:val="bullet"/>
+      <w:lvlText w:val=""/>
+      <w:lvlJc w:val="left"/>
+      <w:pPr>
+        <w:tabs>
+          <w:tab w:val="num" w:pos="6480"/>
+        </w:tabs>
+        <w:ind w:left="6480" w:hanging="360"/>
+      </w:pPr>
+      <w:rPr>
+        <w:rFonts w:ascii="Symbol" w:hAnsi="Symbol" w:hint="default"/>
+        <w:sz w:val="20"/>
+      </w:rPr>
+    </w:lvl>
+  </w:abstractNum>
+  <w:abstractNum w:abstractNumId="15" w15:restartNumberingAfterBreak="0">
+    <w:nsid w:val="63144E36"/>
+    <w:multiLevelType w:val="multilevel"/>
+    <w:tmpl w:val="67721728"/>
+    <w:lvl w:ilvl="0">
+      <w:start w:val="1"/>
+      <w:numFmt w:val="bullet"/>
+      <w:lvlText w:val=""/>
+      <w:lvlJc w:val="left"/>
+      <w:pPr>
+        <w:tabs>
+          <w:tab w:val="num" w:pos="720"/>
+        </w:tabs>
+        <w:ind w:left="720" w:hanging="360"/>
+      </w:pPr>
+      <w:rPr>
+        <w:rFonts w:ascii="Symbol" w:hAnsi="Symbol" w:hint="default"/>
+        <w:sz w:val="20"/>
+      </w:rPr>
+    </w:lvl>
+    <w:lvl w:ilvl="1" w:tentative="1">
+      <w:start w:val="1"/>
+      <w:numFmt w:val="bullet"/>
+      <w:lvlText w:val=""/>
+      <w:lvlJc w:val="left"/>
+      <w:pPr>
+        <w:tabs>
+          <w:tab w:val="num" w:pos="1440"/>
+        </w:tabs>
+        <w:ind w:left="1440" w:hanging="360"/>
+      </w:pPr>
+      <w:rPr>
+        <w:rFonts w:ascii="Symbol" w:hAnsi="Symbol" w:hint="default"/>
+        <w:sz w:val="20"/>
+      </w:rPr>
+    </w:lvl>
+    <w:lvl w:ilvl="2" w:tentative="1">
+      <w:start w:val="1"/>
+      <w:numFmt w:val="bullet"/>
+      <w:lvlText w:val=""/>
+      <w:lvlJc w:val="left"/>
+      <w:pPr>
+        <w:tabs>
+          <w:tab w:val="num" w:pos="2160"/>
+        </w:tabs>
+        <w:ind w:left="2160" w:hanging="360"/>
+      </w:pPr>
+      <w:rPr>
+        <w:rFonts w:ascii="Symbol" w:hAnsi="Symbol" w:hint="default"/>
+        <w:sz w:val="20"/>
+      </w:rPr>
+    </w:lvl>
+    <w:lvl w:ilvl="3" w:tentative="1">
+      <w:start w:val="1"/>
+      <w:numFmt w:val="bullet"/>
+      <w:lvlText w:val=""/>
+      <w:lvlJc w:val="left"/>
+      <w:pPr>
+        <w:tabs>
+          <w:tab w:val="num" w:pos="2880"/>
+        </w:tabs>
+        <w:ind w:left="2880" w:hanging="360"/>
+      </w:pPr>
+      <w:rPr>
+        <w:rFonts w:ascii="Symbol" w:hAnsi="Symbol" w:hint="default"/>
+        <w:sz w:val="20"/>
+      </w:rPr>
+    </w:lvl>
+    <w:lvl w:ilvl="4" w:tentative="1">
+      <w:start w:val="1"/>
+      <w:numFmt w:val="bullet"/>
+      <w:lvlText w:val=""/>
+      <w:lvlJc w:val="left"/>
+      <w:pPr>
+        <w:tabs>
+          <w:tab w:val="num" w:pos="3600"/>
+        </w:tabs>
+        <w:ind w:left="3600" w:hanging="360"/>
+      </w:pPr>
+      <w:rPr>
+        <w:rFonts w:ascii="Symbol" w:hAnsi="Symbol" w:hint="default"/>
+        <w:sz w:val="20"/>
+      </w:rPr>
+    </w:lvl>
+    <w:lvl w:ilvl="5" w:tentative="1">
+      <w:start w:val="1"/>
+      <w:numFmt w:val="bullet"/>
+      <w:lvlText w:val=""/>
+      <w:lvlJc w:val="left"/>
+      <w:pPr>
+        <w:tabs>
+          <w:tab w:val="num" w:pos="4320"/>
+        </w:tabs>
+        <w:ind w:left="4320" w:hanging="360"/>
+      </w:pPr>
+      <w:rPr>
+        <w:rFonts w:ascii="Symbol" w:hAnsi="Symbol" w:hint="default"/>
+        <w:sz w:val="20"/>
+      </w:rPr>
+    </w:lvl>
+    <w:lvl w:ilvl="6" w:tentative="1">
+      <w:start w:val="1"/>
+      <w:numFmt w:val="bullet"/>
+      <w:lvlText w:val=""/>
+      <w:lvlJc w:val="left"/>
+      <w:pPr>
+        <w:tabs>
+          <w:tab w:val="num" w:pos="5040"/>
+        </w:tabs>
+        <w:ind w:left="5040" w:hanging="360"/>
+      </w:pPr>
+      <w:rPr>
+        <w:rFonts w:ascii="Symbol" w:hAnsi="Symbol" w:hint="default"/>
+        <w:sz w:val="20"/>
+      </w:rPr>
+    </w:lvl>
+    <w:lvl w:ilvl="7" w:tentative="1">
+      <w:start w:val="1"/>
+      <w:numFmt w:val="bullet"/>
+      <w:lvlText w:val=""/>
+      <w:lvlJc w:val="left"/>
+      <w:pPr>
+        <w:tabs>
+          <w:tab w:val="num" w:pos="5760"/>
+        </w:tabs>
+        <w:ind w:left="5760" w:hanging="360"/>
+      </w:pPr>
+      <w:rPr>
+        <w:rFonts w:ascii="Symbol" w:hAnsi="Symbol" w:hint="default"/>
+        <w:sz w:val="20"/>
+      </w:rPr>
+    </w:lvl>
+    <w:lvl w:ilvl="8" w:tentative="1">
+      <w:start w:val="1"/>
+      <w:numFmt w:val="bullet"/>
+      <w:lvlText w:val=""/>
+      <w:lvlJc w:val="left"/>
+      <w:pPr>
+        <w:tabs>
+          <w:tab w:val="num" w:pos="6480"/>
+        </w:tabs>
+        <w:ind w:left="6480" w:hanging="360"/>
+      </w:pPr>
+      <w:rPr>
+        <w:rFonts w:ascii="Symbol" w:hAnsi="Symbol" w:hint="default"/>
+        <w:sz w:val="20"/>
+      </w:rPr>
+    </w:lvl>
+  </w:abstractNum>
+  <w:abstractNum w:abstractNumId="16" w15:restartNumberingAfterBreak="0">
+    <w:nsid w:val="7CD25237"/>
+    <w:multiLevelType w:val="multilevel"/>
+    <w:tmpl w:val="396E9D48"/>
+    <w:lvl w:ilvl="0">
+      <w:start w:val="1"/>
+      <w:numFmt w:val="bullet"/>
+      <w:lvlText w:val=""/>
+      <w:lvlJc w:val="left"/>
+      <w:pPr>
+        <w:tabs>
+          <w:tab w:val="num" w:pos="720"/>
+        </w:tabs>
+        <w:ind w:left="720" w:hanging="360"/>
+      </w:pPr>
+      <w:rPr>
+        <w:rFonts w:ascii="Symbol" w:hAnsi="Symbol" w:hint="default"/>
+        <w:sz w:val="20"/>
+      </w:rPr>
+    </w:lvl>
+    <w:lvl w:ilvl="1" w:tentative="1">
+      <w:start w:val="1"/>
+      <w:numFmt w:val="bullet"/>
+      <w:lvlText w:val=""/>
+      <w:lvlJc w:val="left"/>
+      <w:pPr>
+        <w:tabs>
+          <w:tab w:val="num" w:pos="1440"/>
+        </w:tabs>
+        <w:ind w:left="1440" w:hanging="360"/>
+      </w:pPr>
+      <w:rPr>
+        <w:rFonts w:ascii="Symbol" w:hAnsi="Symbol" w:hint="default"/>
+        <w:sz w:val="20"/>
+      </w:rPr>
+    </w:lvl>
+    <w:lvl w:ilvl="2" w:tentative="1">
+      <w:start w:val="1"/>
+      <w:numFmt w:val="bullet"/>
+      <w:lvlText w:val=""/>
+      <w:lvlJc w:val="left"/>
+      <w:pPr>
+        <w:tabs>
+          <w:tab w:val="num" w:pos="2160"/>
+        </w:tabs>
+        <w:ind w:left="2160" w:hanging="360"/>
+      </w:pPr>
+      <w:rPr>
+        <w:rFonts w:ascii="Symbol" w:hAnsi="Symbol" w:hint="default"/>
+        <w:sz w:val="20"/>
+      </w:rPr>
+    </w:lvl>
+    <w:lvl w:ilvl="3" w:tentative="1">
+      <w:start w:val="1"/>
+      <w:numFmt w:val="bullet"/>
+      <w:lvlText w:val=""/>
+      <w:lvlJc w:val="left"/>
+      <w:pPr>
+        <w:tabs>
+          <w:tab w:val="num" w:pos="2880"/>
+        </w:tabs>
+        <w:ind w:left="2880" w:hanging="360"/>
+      </w:pPr>
+      <w:rPr>
+        <w:rFonts w:ascii="Symbol" w:hAnsi="Symbol" w:hint="default"/>
+        <w:sz w:val="20"/>
+      </w:rPr>
+    </w:lvl>
+    <w:lvl w:ilvl="4" w:tentative="1">
+      <w:start w:val="1"/>
+      <w:numFmt w:val="bullet"/>
+      <w:lvlText w:val=""/>
+      <w:lvlJc w:val="left"/>
+      <w:pPr>
+        <w:tabs>
+          <w:tab w:val="num" w:pos="3600"/>
+        </w:tabs>
+        <w:ind w:left="3600" w:hanging="360"/>
+      </w:pPr>
+      <w:rPr>
+        <w:rFonts w:ascii="Symbol" w:hAnsi="Symbol" w:hint="default"/>
+        <w:sz w:val="20"/>
+      </w:rPr>
+    </w:lvl>
+    <w:lvl w:ilvl="5" w:tentative="1">
+      <w:start w:val="1"/>
+      <w:numFmt w:val="bullet"/>
+      <w:lvlText w:val=""/>
+      <w:lvlJc w:val="left"/>
+      <w:pPr>
+        <w:tabs>
+          <w:tab w:val="num" w:pos="4320"/>
+        </w:tabs>
+        <w:ind w:left="4320" w:hanging="360"/>
+      </w:pPr>
+      <w:rPr>
+        <w:rFonts w:ascii="Symbol" w:hAnsi="Symbol" w:hint="default"/>
+        <w:sz w:val="20"/>
+      </w:rPr>
+    </w:lvl>
+    <w:lvl w:ilvl="6" w:tentative="1">
+      <w:start w:val="1"/>
+      <w:numFmt w:val="bullet"/>
+      <w:lvlText w:val=""/>
+      <w:lvlJc w:val="left"/>
+      <w:pPr>
+        <w:tabs>
+          <w:tab w:val="num" w:pos="5040"/>
+        </w:tabs>
+        <w:ind w:left="5040" w:hanging="360"/>
+      </w:pPr>
+      <w:rPr>
+        <w:rFonts w:ascii="Symbol" w:hAnsi="Symbol" w:hint="default"/>
+        <w:sz w:val="20"/>
+      </w:rPr>
+    </w:lvl>
+    <w:lvl w:ilvl="7" w:tentative="1">
+      <w:start w:val="1"/>
+      <w:numFmt w:val="bullet"/>
+      <w:lvlText w:val=""/>
+      <w:lvlJc w:val="left"/>
+      <w:pPr>
+        <w:tabs>
+          <w:tab w:val="num" w:pos="5760"/>
+        </w:tabs>
+        <w:ind w:left="5760" w:hanging="360"/>
+      </w:pPr>
+      <w:rPr>
+        <w:rFonts w:ascii="Symbol" w:hAnsi="Symbol" w:hint="default"/>
+        <w:sz w:val="20"/>
+      </w:rPr>
+    </w:lvl>
+    <w:lvl w:ilvl="8" w:tentative="1">
+      <w:start w:val="1"/>
+      <w:numFmt w:val="bullet"/>
+      <w:lvlText w:val=""/>
+      <w:lvlJc w:val="left"/>
+      <w:pPr>
+        <w:tabs>
+          <w:tab w:val="num" w:pos="6480"/>
+        </w:tabs>
+        <w:ind w:left="6480" w:hanging="360"/>
+      </w:pPr>
+      <w:rPr>
+        <w:rFonts w:ascii="Symbol" w:hAnsi="Symbol" w:hint="default"/>
+        <w:sz w:val="20"/>
+      </w:rPr>
+    </w:lvl>
+  </w:abstractNum>
+  <w:abstractNum w:abstractNumId="17" w15:restartNumberingAfterBreak="0">
+    <w:nsid w:val="7EEC6887"/>
+    <w:multiLevelType w:val="multilevel"/>
+    <w:tmpl w:val="8D6AA226"/>
+    <w:lvl w:ilvl="0">
+      <w:start w:val="1"/>
+      <w:numFmt w:val="bullet"/>
+      <w:lvlText w:val=""/>
+      <w:lvlJc w:val="left"/>
+      <w:pPr>
+        <w:tabs>
+          <w:tab w:val="num" w:pos="720"/>
+        </w:tabs>
+        <w:ind w:left="720" w:hanging="360"/>
+      </w:pPr>
+      <w:rPr>
+        <w:rFonts w:ascii="Symbol" w:hAnsi="Symbol" w:hint="default"/>
+        <w:sz w:val="20"/>
+      </w:rPr>
+    </w:lvl>
+    <w:lvl w:ilvl="1" w:tentative="1">
+      <w:start w:val="1"/>
+      <w:numFmt w:val="bullet"/>
+      <w:lvlText w:val=""/>
+      <w:lvlJc w:val="left"/>
+      <w:pPr>
+        <w:tabs>
+          <w:tab w:val="num" w:pos="1440"/>
+        </w:tabs>
+        <w:ind w:left="1440" w:hanging="360"/>
+      </w:pPr>
+      <w:rPr>
+        <w:rFonts w:ascii="Symbol" w:hAnsi="Symbol" w:hint="default"/>
+        <w:sz w:val="20"/>
+      </w:rPr>
+    </w:lvl>
+    <w:lvl w:ilvl="2" w:tentative="1">
+      <w:start w:val="1"/>
+      <w:numFmt w:val="bullet"/>
+      <w:lvlText w:val=""/>
+      <w:lvlJc w:val="left"/>
+      <w:pPr>
+        <w:tabs>
+          <w:tab w:val="num" w:pos="2160"/>
+        </w:tabs>
+        <w:ind w:left="2160" w:hanging="360"/>
+      </w:pPr>
+      <w:rPr>
+        <w:rFonts w:ascii="Symbol" w:hAnsi="Symbol" w:hint="default"/>
+        <w:sz w:val="20"/>
+      </w:rPr>
+    </w:lvl>
+    <w:lvl w:ilvl="3" w:tentative="1">
+      <w:start w:val="1"/>
+      <w:numFmt w:val="bullet"/>
+      <w:lvlText w:val=""/>
+      <w:lvlJc w:val="left"/>
+      <w:pPr>
+        <w:tabs>
+          <w:tab w:val="num" w:pos="2880"/>
+        </w:tabs>
+        <w:ind w:left="2880" w:hanging="360"/>
+      </w:pPr>
+      <w:rPr>
+        <w:rFonts w:ascii="Symbol" w:hAnsi="Symbol" w:hint="default"/>
+        <w:sz w:val="20"/>
+      </w:rPr>
+    </w:lvl>
+    <w:lvl w:ilvl="4" w:tentative="1">
+      <w:start w:val="1"/>
+      <w:numFmt w:val="bullet"/>
+      <w:lvlText w:val=""/>
+      <w:lvlJc w:val="left"/>
+      <w:pPr>
+        <w:tabs>
+          <w:tab w:val="num" w:pos="3600"/>
+        </w:tabs>
+        <w:ind w:left="3600" w:hanging="360"/>
+      </w:pPr>
+      <w:rPr>
+        <w:rFonts w:ascii="Symbol" w:hAnsi="Symbol" w:hint="default"/>
+        <w:sz w:val="20"/>
+      </w:rPr>
+    </w:lvl>
+    <w:lvl w:ilvl="5" w:tentative="1">
+      <w:start w:val="1"/>
+      <w:numFmt w:val="bullet"/>
+      <w:lvlText w:val=""/>
+      <w:lvlJc w:val="left"/>
+      <w:pPr>
+        <w:tabs>
+          <w:tab w:val="num" w:pos="4320"/>
+        </w:tabs>
+        <w:ind w:left="4320" w:hanging="360"/>
+      </w:pPr>
+      <w:rPr>
+        <w:rFonts w:ascii="Symbol" w:hAnsi="Symbol" w:hint="default"/>
+        <w:sz w:val="20"/>
+      </w:rPr>
+    </w:lvl>
+    <w:lvl w:ilvl="6" w:tentative="1">
+      <w:start w:val="1"/>
+      <w:numFmt w:val="bullet"/>
+      <w:lvlText w:val=""/>
+      <w:lvlJc w:val="left"/>
+      <w:pPr>
+        <w:tabs>
+          <w:tab w:val="num" w:pos="5040"/>
+        </w:tabs>
+        <w:ind w:left="5040" w:hanging="360"/>
+      </w:pPr>
+      <w:rPr>
+        <w:rFonts w:ascii="Symbol" w:hAnsi="Symbol" w:hint="default"/>
+        <w:sz w:val="20"/>
+      </w:rPr>
+    </w:lvl>
+    <w:lvl w:ilvl="7" w:tentative="1">
+      <w:start w:val="1"/>
+      <w:numFmt w:val="bullet"/>
+      <w:lvlText w:val=""/>
+      <w:lvlJc w:val="left"/>
+      <w:pPr>
+        <w:tabs>
+          <w:tab w:val="num" w:pos="5760"/>
+        </w:tabs>
+        <w:ind w:left="5760" w:hanging="360"/>
+      </w:pPr>
+      <w:rPr>
+        <w:rFonts w:ascii="Symbol" w:hAnsi="Symbol" w:hint="default"/>
+        <w:sz w:val="20"/>
+      </w:rPr>
+    </w:lvl>
+    <w:lvl w:ilvl="8" w:tentative="1">
+      <w:start w:val="1"/>
+      <w:numFmt w:val="bullet"/>
+      <w:lvlText w:val=""/>
+      <w:lvlJc w:val="left"/>
+      <w:pPr>
+        <w:tabs>
+          <w:tab w:val="num" w:pos="6480"/>
+        </w:tabs>
+        <w:ind w:left="6480" w:hanging="360"/>
+      </w:pPr>
+      <w:rPr>
+        <w:rFonts w:ascii="Symbol" w:hAnsi="Symbol" w:hint="default"/>
+        <w:sz w:val="20"/>
       </w:rPr>
     </w:lvl>
   </w:abstractNum>
@@ -1705,6 +4088,33 @@
   </w:num>
   <w:num w:numId="9" w16cid:durableId="1738891099">
     <w:abstractNumId w:val="0"/>
+  </w:num>
+  <w:num w:numId="10" w16cid:durableId="1699356747">
+    <w:abstractNumId w:val="15"/>
+  </w:num>
+  <w:num w:numId="11" w16cid:durableId="365756664">
+    <w:abstractNumId w:val="17"/>
+  </w:num>
+  <w:num w:numId="12" w16cid:durableId="843470511">
+    <w:abstractNumId w:val="11"/>
+  </w:num>
+  <w:num w:numId="13" w16cid:durableId="32194332">
+    <w:abstractNumId w:val="10"/>
+  </w:num>
+  <w:num w:numId="14" w16cid:durableId="1486512868">
+    <w:abstractNumId w:val="14"/>
+  </w:num>
+  <w:num w:numId="15" w16cid:durableId="1340623433">
+    <w:abstractNumId w:val="9"/>
+  </w:num>
+  <w:num w:numId="16" w16cid:durableId="1025205619">
+    <w:abstractNumId w:val="13"/>
+  </w:num>
+  <w:num w:numId="17" w16cid:durableId="872617775">
+    <w:abstractNumId w:val="12"/>
+  </w:num>
+  <w:num w:numId="18" w16cid:durableId="2092963840">
+    <w:abstractNumId w:val="16"/>
   </w:num>
 </w:numbering>
 </file>
@@ -2320,7 +4730,6 @@
   <w:style w:type="character" w:default="1" w:styleId="DefaultParagraphFont">
     <w:name w:val="Default Paragraph Font"/>
     <w:uiPriority w:val="1"/>
-    <w:semiHidden/>
     <w:unhideWhenUsed/>
   </w:style>
   <w:style w:type="table" w:default="1" w:styleId="TableNormal">
@@ -11238,7 +13647,7 @@
       </w:tcPr>
     </w:tblStylePr>
   </w:style>
-  <w:style w:type="table" w:styleId="ColourfulShading">
+  <w:style w:type="table" w:styleId="ColorfulShading">
     <w:name w:val="Colorful Shading"/>
     <w:basedOn w:val="TableNormal"/>
     <w:uiPriority w:val="71"/>
@@ -11353,7 +13762,7 @@
       </w:rPr>
     </w:tblStylePr>
   </w:style>
-  <w:style w:type="table" w:styleId="ColourfulShadingAccent1">
+  <w:style w:type="table" w:styleId="ColorfulShading-Accent1">
     <w:name w:val="Colorful Shading Accent 1"/>
     <w:basedOn w:val="TableNormal"/>
     <w:uiPriority w:val="71"/>
@@ -11468,7 +13877,7 @@
       </w:rPr>
     </w:tblStylePr>
   </w:style>
-  <w:style w:type="table" w:styleId="ColourfulShadingAccent2">
+  <w:style w:type="table" w:styleId="ColorfulShading-Accent2">
     <w:name w:val="Colorful Shading Accent 2"/>
     <w:basedOn w:val="TableNormal"/>
     <w:uiPriority w:val="71"/>
@@ -11583,7 +13992,7 @@
       </w:rPr>
     </w:tblStylePr>
   </w:style>
-  <w:style w:type="table" w:styleId="ColourfulShadingAccent3">
+  <w:style w:type="table" w:styleId="ColorfulShading-Accent3">
     <w:name w:val="Colorful Shading Accent 3"/>
     <w:basedOn w:val="TableNormal"/>
     <w:uiPriority w:val="71"/>
@@ -11688,7 +14097,7 @@
       </w:tcPr>
     </w:tblStylePr>
   </w:style>
-  <w:style w:type="table" w:styleId="ColourfulShadingAccent4">
+  <w:style w:type="table" w:styleId="ColorfulShading-Accent4">
     <w:name w:val="Colorful Shading Accent 4"/>
     <w:basedOn w:val="TableNormal"/>
     <w:uiPriority w:val="71"/>
@@ -11803,7 +14212,7 @@
       </w:rPr>
     </w:tblStylePr>
   </w:style>
-  <w:style w:type="table" w:styleId="ColourfulShadingAccent5">
+  <w:style w:type="table" w:styleId="ColorfulShading-Accent5">
     <w:name w:val="Colorful Shading Accent 5"/>
     <w:basedOn w:val="TableNormal"/>
     <w:uiPriority w:val="71"/>
@@ -11918,7 +14327,7 @@
       </w:rPr>
     </w:tblStylePr>
   </w:style>
-  <w:style w:type="table" w:styleId="ColourfulShadingAccent6">
+  <w:style w:type="table" w:styleId="ColorfulShading-Accent6">
     <w:name w:val="Colorful Shading Accent 6"/>
     <w:basedOn w:val="TableNormal"/>
     <w:uiPriority w:val="71"/>
@@ -12033,7 +14442,7 @@
       </w:rPr>
     </w:tblStylePr>
   </w:style>
-  <w:style w:type="table" w:styleId="ColourfulList">
+  <w:style w:type="table" w:styleId="ColorfulList">
     <w:name w:val="Colorful List"/>
     <w:basedOn w:val="TableNormal"/>
     <w:uiPriority w:val="72"/>
@@ -12112,7 +14521,7 @@
       </w:tcPr>
     </w:tblStylePr>
   </w:style>
-  <w:style w:type="table" w:styleId="ColourfulListAccent1">
+  <w:style w:type="table" w:styleId="ColorfulList-Accent1">
     <w:name w:val="Colorful List Accent 1"/>
     <w:basedOn w:val="TableNormal"/>
     <w:uiPriority w:val="72"/>
@@ -12191,7 +14600,7 @@
       </w:tcPr>
     </w:tblStylePr>
   </w:style>
-  <w:style w:type="table" w:styleId="ColourfulListAccent2">
+  <w:style w:type="table" w:styleId="ColorfulList-Accent2">
     <w:name w:val="Colorful List Accent 2"/>
     <w:basedOn w:val="TableNormal"/>
     <w:uiPriority w:val="72"/>
@@ -12270,7 +14679,7 @@
       </w:tcPr>
     </w:tblStylePr>
   </w:style>
-  <w:style w:type="table" w:styleId="ColourfulListAccent3">
+  <w:style w:type="table" w:styleId="ColorfulList-Accent3">
     <w:name w:val="Colorful List Accent 3"/>
     <w:basedOn w:val="TableNormal"/>
     <w:uiPriority w:val="72"/>
@@ -12349,7 +14758,7 @@
       </w:tcPr>
     </w:tblStylePr>
   </w:style>
-  <w:style w:type="table" w:styleId="ColourfulListAccent4">
+  <w:style w:type="table" w:styleId="ColorfulList-Accent4">
     <w:name w:val="Colorful List Accent 4"/>
     <w:basedOn w:val="TableNormal"/>
     <w:uiPriority w:val="72"/>
@@ -12428,7 +14837,7 @@
       </w:tcPr>
     </w:tblStylePr>
   </w:style>
-  <w:style w:type="table" w:styleId="ColourfulListAccent5">
+  <w:style w:type="table" w:styleId="ColorfulList-Accent5">
     <w:name w:val="Colorful List Accent 5"/>
     <w:basedOn w:val="TableNormal"/>
     <w:uiPriority w:val="72"/>
@@ -12507,7 +14916,7 @@
       </w:tcPr>
     </w:tblStylePr>
   </w:style>
-  <w:style w:type="table" w:styleId="ColourfulListAccent6">
+  <w:style w:type="table" w:styleId="ColorfulList-Accent6">
     <w:name w:val="Colorful List Accent 6"/>
     <w:basedOn w:val="TableNormal"/>
     <w:uiPriority w:val="72"/>
@@ -12586,7 +14995,7 @@
       </w:tcPr>
     </w:tblStylePr>
   </w:style>
-  <w:style w:type="table" w:styleId="ColourfulGrid">
+  <w:style w:type="table" w:styleId="ColorfulGrid">
     <w:name w:val="Colorful Grid"/>
     <w:basedOn w:val="TableNormal"/>
     <w:uiPriority w:val="73"/>
@@ -12659,7 +15068,7 @@
       </w:tcPr>
     </w:tblStylePr>
   </w:style>
-  <w:style w:type="table" w:styleId="ColourfulGridAccent1">
+  <w:style w:type="table" w:styleId="ColorfulGrid-Accent1">
     <w:name w:val="Colorful Grid Accent 1"/>
     <w:basedOn w:val="TableNormal"/>
     <w:uiPriority w:val="73"/>
@@ -12732,7 +15141,7 @@
       </w:tcPr>
     </w:tblStylePr>
   </w:style>
-  <w:style w:type="table" w:styleId="ColourfulGridAccent2">
+  <w:style w:type="table" w:styleId="ColorfulGrid-Accent2">
     <w:name w:val="Colorful Grid Accent 2"/>
     <w:basedOn w:val="TableNormal"/>
     <w:uiPriority w:val="73"/>
@@ -12805,7 +15214,7 @@
       </w:tcPr>
     </w:tblStylePr>
   </w:style>
-  <w:style w:type="table" w:styleId="ColourfulGridAccent3">
+  <w:style w:type="table" w:styleId="ColorfulGrid-Accent3">
     <w:name w:val="Colorful Grid Accent 3"/>
     <w:basedOn w:val="TableNormal"/>
     <w:uiPriority w:val="73"/>
@@ -12878,7 +15287,7 @@
       </w:tcPr>
     </w:tblStylePr>
   </w:style>
-  <w:style w:type="table" w:styleId="ColourfulGridAccent4">
+  <w:style w:type="table" w:styleId="ColorfulGrid-Accent4">
     <w:name w:val="Colorful Grid Accent 4"/>
     <w:basedOn w:val="TableNormal"/>
     <w:uiPriority w:val="73"/>
@@ -12951,7 +15360,7 @@
       </w:tcPr>
     </w:tblStylePr>
   </w:style>
-  <w:style w:type="table" w:styleId="ColourfulGridAccent5">
+  <w:style w:type="table" w:styleId="ColorfulGrid-Accent5">
     <w:name w:val="Colorful Grid Accent 5"/>
     <w:basedOn w:val="TableNormal"/>
     <w:uiPriority w:val="73"/>
@@ -13024,7 +15433,7 @@
       </w:tcPr>
     </w:tblStylePr>
   </w:style>
-  <w:style w:type="table" w:styleId="ColourfulGridAccent6">
+  <w:style w:type="table" w:styleId="ColorfulGrid-Accent6">
     <w:name w:val="Colorful Grid Accent 6"/>
     <w:basedOn w:val="TableNormal"/>
     <w:uiPriority w:val="73"/>

</xml_diff>